<commit_message>
Added cotgenration prompt ipynb
</commit_message>
<xml_diff>
--- a/LLM-RE_Prompt_Templates.docx
+++ b/LLM-RE_Prompt_Templates.docx
@@ -23,6 +23,28 @@
         </w:rPr>
         <w:t xml:space="preserve">LLM-RE Framework: </w:t>
       </w:r>
+      <w:r>
+        <w:rPr>
+          <w:b/>
+          <w:bCs/>
+          <w:sz w:val="28"/>
+          <w:szCs w:val="28"/>
+          <w:u w:val="single"/>
+        </w:rPr>
+        <w:t>Inference Prompts</w:t>
+      </w:r>
+    </w:p>
+    <w:p>
+      <w:pPr>
+        <w:jc w:val="center"/>
+        <w:rPr>
+          <w:b/>
+          <w:bCs/>
+          <w:sz w:val="28"/>
+          <w:szCs w:val="28"/>
+          <w:u w:val="single"/>
+        </w:rPr>
+      </w:pPr>
       <w:r>
         <w:rPr>
           <w:b/>
@@ -174,7 +196,21 @@
         <w:rPr>
           <w:rFonts w:cs="Calibri"/>
         </w:rPr>
-        <w:t>You will generate a response in the form: In the given sentence, the relationship between &lt;head-entity&gt; and &lt;tail-entity&gt; entities is: &lt;best from the list of relationships&gt;.</w:t>
+        <w:t xml:space="preserve">You will generate a response in the form: In the given sentence, the relationship between &lt;head-entity&gt; and &lt;tail-entity&gt; entities </w:t>
+      </w:r>
+      <w:proofErr w:type="gramStart"/>
+      <w:r>
+        <w:rPr>
+          <w:rFonts w:cs="Calibri"/>
+        </w:rPr>
+        <w:t>is</w:t>
+      </w:r>
+      <w:proofErr w:type="gramEnd"/>
+      <w:r>
+        <w:rPr>
+          <w:rFonts w:cs="Calibri"/>
+        </w:rPr>
+        <w:t>: &lt;best from the list of relationships&gt;.</w:t>
       </w:r>
     </w:p>
     <w:p>
@@ -231,7 +267,21 @@
         <w:rPr>
           <w:rFonts w:cs="Calibri"/>
         </w:rPr>
-        <w:t>In the given sentence, the relationship between [HEAD ENTITY] and [TAIL ENTITY] entities is:'''</w:t>
+        <w:t xml:space="preserve">In the given sentence, the relationship between [HEAD ENTITY] and [TAIL ENTITY] entities </w:t>
+      </w:r>
+      <w:proofErr w:type="gramStart"/>
+      <w:r>
+        <w:rPr>
+          <w:rFonts w:cs="Calibri"/>
+        </w:rPr>
+        <w:t>is</w:t>
+      </w:r>
+      <w:proofErr w:type="gramEnd"/>
+      <w:r>
+        <w:rPr>
+          <w:rFonts w:cs="Calibri"/>
+        </w:rPr>
+        <w:t>:'''</w:t>
       </w:r>
     </w:p>
     <w:p>
@@ -458,6 +508,7 @@
         <w:spacing w:after="0"/>
       </w:pPr>
       <w:r>
+        <w:lastRenderedPageBreak/>
         <w:t xml:space="preserve">9. PRODUCT-PRODUCER relationship occurs when a producer is actively involved in the creation of the product. </w:t>
       </w:r>
     </w:p>
@@ -472,7 +523,6 @@
         <w:spacing w:after="0"/>
       </w:pPr>
       <w:r>
-        <w:lastRenderedPageBreak/>
         <w:t xml:space="preserve">10. NONE relationship occurs when the relationship between the head entity and the tail entity cannot be categorised in one of the above nine relationships. </w:t>
       </w:r>
     </w:p>
@@ -499,7 +549,15 @@
         </w:pBdr>
       </w:pPr>
       <w:r>
-        <w:t xml:space="preserve">You will generate response in the form: In the given sentence, the relationship between &lt;head-entity&gt; and &lt;tail-entity&gt; entities is: &lt;best from the list of relationships&gt;. </w:t>
+        <w:t xml:space="preserve">You will generate response in the form: In the given sentence, the relationship between &lt;head-entity&gt; and &lt;tail-entity&gt; entities </w:t>
+      </w:r>
+      <w:proofErr w:type="gramStart"/>
+      <w:r>
+        <w:t>is</w:t>
+      </w:r>
+      <w:proofErr w:type="gramEnd"/>
+      <w:r>
+        <w:t xml:space="preserve">: &lt;best from the list of relationships&gt;. </w:t>
       </w:r>
     </w:p>
     <w:p>
@@ -544,7 +602,15 @@
         </w:pBdr>
       </w:pPr>
       <w:r>
-        <w:t>In the given sentence, the relationship between [HEAD ENTITY] and [TAIL ENTITY] entities is:'''</w:t>
+        <w:t xml:space="preserve">In the given sentence, the relationship between [HEAD ENTITY] and [TAIL ENTITY] entities </w:t>
+      </w:r>
+      <w:proofErr w:type="gramStart"/>
+      <w:r>
+        <w:t>is</w:t>
+      </w:r>
+      <w:proofErr w:type="gramEnd"/>
+      <w:r>
+        <w:t>:'''</w:t>
       </w:r>
     </w:p>
     <w:p>
@@ -639,7 +705,15 @@
         </w:pBdr>
       </w:pPr>
       <w:r>
-        <w:t xml:space="preserve">You will generate response in the form: In the given sentence, the relationship between &lt;head-entity&gt; and &lt;tail-entity&gt; entities is: &lt;best from the list of relationships&gt;. </w:t>
+        <w:t xml:space="preserve">You will generate response in the form: In the given sentence, the relationship between &lt;head-entity&gt; and &lt;tail-entity&gt; entities </w:t>
+      </w:r>
+      <w:proofErr w:type="gramStart"/>
+      <w:r>
+        <w:t>is</w:t>
+      </w:r>
+      <w:proofErr w:type="gramEnd"/>
+      <w:r>
+        <w:t xml:space="preserve">: &lt;best from the list of relationships&gt;. </w:t>
       </w:r>
     </w:p>
     <w:p>
@@ -712,7 +786,15 @@
         </w:pBdr>
       </w:pPr>
       <w:r>
-        <w:t>In the above sentence, the relationship between [HEAD ENTITY] and [TAIL ENTITY] entities is: [RELATIONSHIP]</w:t>
+        <w:t xml:space="preserve">In the above sentence, the relationship between [HEAD ENTITY] and [TAIL ENTITY] entities </w:t>
+      </w:r>
+      <w:proofErr w:type="gramStart"/>
+      <w:r>
+        <w:t>is</w:t>
+      </w:r>
+      <w:proofErr w:type="gramEnd"/>
+      <w:r>
+        <w:t>: [RELATIONSHIP]</w:t>
       </w:r>
     </w:p>
     <w:p>
@@ -759,7 +841,15 @@
         </w:pBdr>
       </w:pPr>
       <w:r>
-        <w:t>In the above sentence, the relationship between [HEAD ENTITY] and [TAIL ENTITY] entities is: [RELATIONSHIP]</w:t>
+        <w:t xml:space="preserve">In the above sentence, the relationship between [HEAD ENTITY] and [TAIL ENTITY] entities </w:t>
+      </w:r>
+      <w:proofErr w:type="gramStart"/>
+      <w:r>
+        <w:t>is</w:t>
+      </w:r>
+      <w:proofErr w:type="gramEnd"/>
+      <w:r>
+        <w:t>: [RELATIONSHIP]</w:t>
       </w:r>
     </w:p>
     <w:p>
@@ -806,7 +896,15 @@
         </w:pBdr>
       </w:pPr>
       <w:r>
-        <w:t>In the above sentence, the relationship between [HEAD ENTITY] and [TAIL ENTITY] entities is: [RELATIONSHIP]</w:t>
+        <w:t xml:space="preserve">In the above sentence, the relationship between [HEAD ENTITY] and [TAIL ENTITY] entities </w:t>
+      </w:r>
+      <w:proofErr w:type="gramStart"/>
+      <w:r>
+        <w:t>is</w:t>
+      </w:r>
+      <w:proofErr w:type="gramEnd"/>
+      <w:r>
+        <w:t>: [RELATIONSHIP]</w:t>
       </w:r>
     </w:p>
     <w:p>
@@ -853,20 +951,29 @@
         </w:pBdr>
       </w:pPr>
       <w:r>
-        <w:t>In the above sentence, the relationship between [HEAD ENTITY] and [TAIL ENTITY] entities is: [RELATIONSHIP]</w:t>
-      </w:r>
-    </w:p>
-    <w:p>
-      <w:pPr>
-        <w:pBdr>
-          <w:top w:val="single" w:sz="4" w:space="1" w:color="auto"/>
-          <w:left w:val="single" w:sz="4" w:space="4" w:color="auto"/>
-          <w:bottom w:val="single" w:sz="4" w:space="1" w:color="auto"/>
-          <w:right w:val="single" w:sz="4" w:space="4" w:color="auto"/>
-        </w:pBdr>
-        <w:spacing w:after="0"/>
-      </w:pPr>
-      <w:r>
+        <w:t xml:space="preserve">In the above sentence, the relationship between [HEAD ENTITY] and [TAIL ENTITY] entities </w:t>
+      </w:r>
+      <w:proofErr w:type="gramStart"/>
+      <w:r>
+        <w:t>is</w:t>
+      </w:r>
+      <w:proofErr w:type="gramEnd"/>
+      <w:r>
+        <w:t>: [RELATIONSHIP]</w:t>
+      </w:r>
+    </w:p>
+    <w:p>
+      <w:pPr>
+        <w:pBdr>
+          <w:top w:val="single" w:sz="4" w:space="1" w:color="auto"/>
+          <w:left w:val="single" w:sz="4" w:space="4" w:color="auto"/>
+          <w:bottom w:val="single" w:sz="4" w:space="1" w:color="auto"/>
+          <w:right w:val="single" w:sz="4" w:space="4" w:color="auto"/>
+        </w:pBdr>
+        <w:spacing w:after="0"/>
+      </w:pPr>
+      <w:r>
+        <w:lastRenderedPageBreak/>
         <w:t>Example-5:</w:t>
       </w:r>
     </w:p>
@@ -900,8 +1007,15 @@
         </w:pBdr>
       </w:pPr>
       <w:r>
-        <w:lastRenderedPageBreak/>
-        <w:t>In the above sentence, the relationship between [HEAD ENTITY] and [TAIL ENTITY] entities is: [RELATIONSHIP]</w:t>
+        <w:t xml:space="preserve">In the above sentence, the relationship between [HEAD ENTITY] and [TAIL ENTITY] entities </w:t>
+      </w:r>
+      <w:proofErr w:type="gramStart"/>
+      <w:r>
+        <w:t>is</w:t>
+      </w:r>
+      <w:proofErr w:type="gramEnd"/>
+      <w:r>
+        <w:t>: [RELATIONSHIP]</w:t>
       </w:r>
     </w:p>
     <w:p>
@@ -959,7 +1073,15 @@
         </w:pBdr>
       </w:pPr>
       <w:r>
-        <w:t>In the given sentence, the relationship between [HEAD ENTITY] and [TAIL ENTITY] entities is:'''</w:t>
+        <w:t xml:space="preserve">In the given sentence, the relationship between [HEAD ENTITY] and [TAIL ENTITY] entities </w:t>
+      </w:r>
+      <w:proofErr w:type="gramStart"/>
+      <w:r>
+        <w:t>is</w:t>
+      </w:r>
+      <w:proofErr w:type="gramEnd"/>
+      <w:r>
+        <w:t>:'''</w:t>
       </w:r>
     </w:p>
     <w:p>
@@ -1069,7 +1191,15 @@
         </w:pBdr>
       </w:pPr>
       <w:r>
-        <w:t xml:space="preserve">You will generate response in the form: In the given sentence, the relationship between &lt;head-entity&gt; and &lt;tail-entity&gt; entities is: &lt;best from the list of relationships&gt;. </w:t>
+        <w:t xml:space="preserve">You will generate response in the form: In the given sentence, the relationship between &lt;head-entity&gt; and &lt;tail-entity&gt; entities </w:t>
+      </w:r>
+      <w:proofErr w:type="gramStart"/>
+      <w:r>
+        <w:t>is</w:t>
+      </w:r>
+      <w:proofErr w:type="gramEnd"/>
+      <w:r>
+        <w:t xml:space="preserve">: &lt;best from the list of relationships&gt;. </w:t>
       </w:r>
     </w:p>
     <w:p>
@@ -1143,7 +1273,15 @@
         <w:spacing w:after="0"/>
       </w:pPr>
       <w:r>
-        <w:t>In the above sentence, the relationship between [HEAD ENTITY] and [TAIL ENTITY] entities is: [RELATIONSHIP]</w:t>
+        <w:t xml:space="preserve">In the above sentence, the relationship between [HEAD ENTITY] and [TAIL ENTITY] entities </w:t>
+      </w:r>
+      <w:proofErr w:type="gramStart"/>
+      <w:r>
+        <w:t>is</w:t>
+      </w:r>
+      <w:proofErr w:type="gramEnd"/>
+      <w:r>
+        <w:t>: [RELATIONSHIP]</w:t>
       </w:r>
     </w:p>
     <w:p>
@@ -1204,7 +1342,15 @@
         <w:spacing w:after="0"/>
       </w:pPr>
       <w:r>
-        <w:t>In the above sentence, the relationship between [HEAD ENTITY] and [TAIL ENTITY] entities is: [RELATIONSHIP]</w:t>
+        <w:t xml:space="preserve">In the above sentence, the relationship between [HEAD ENTITY] and [TAIL ENTITY] entities </w:t>
+      </w:r>
+      <w:proofErr w:type="gramStart"/>
+      <w:r>
+        <w:t>is</w:t>
+      </w:r>
+      <w:proofErr w:type="gramEnd"/>
+      <w:r>
+        <w:t>: [RELATIONSHIP]</w:t>
       </w:r>
     </w:p>
     <w:p>
@@ -1265,7 +1411,15 @@
         <w:spacing w:after="0"/>
       </w:pPr>
       <w:r>
-        <w:t>In the above sentence, the relationship between [HEAD ENTITY] and [TAIL ENTITY] entities is: [RELATIONSHIP]</w:t>
+        <w:t xml:space="preserve">In the above sentence, the relationship between [HEAD ENTITY] and [TAIL ENTITY] entities </w:t>
+      </w:r>
+      <w:proofErr w:type="gramStart"/>
+      <w:r>
+        <w:t>is</w:t>
+      </w:r>
+      <w:proofErr w:type="gramEnd"/>
+      <w:r>
+        <w:t>: [RELATIONSHIP]</w:t>
       </w:r>
     </w:p>
     <w:p>
@@ -1326,7 +1480,16 @@
         <w:spacing w:after="0"/>
       </w:pPr>
       <w:r>
-        <w:t>In the above sentence, the relationship between [HEAD ENTITY] and [TAIL ENTITY] entities is: [RELATIONSHIP]</w:t>
+        <w:lastRenderedPageBreak/>
+        <w:t xml:space="preserve">In the above sentence, the relationship between [HEAD ENTITY] and [TAIL ENTITY] entities </w:t>
+      </w:r>
+      <w:proofErr w:type="gramStart"/>
+      <w:r>
+        <w:t>is</w:t>
+      </w:r>
+      <w:proofErr w:type="gramEnd"/>
+      <w:r>
+        <w:t>: [RELATIONSHIP]</w:t>
       </w:r>
     </w:p>
     <w:p>
@@ -1353,7 +1516,6 @@
         <w:spacing w:after="0"/>
       </w:pPr>
       <w:r>
-        <w:lastRenderedPageBreak/>
         <w:t>Example-5:</w:t>
       </w:r>
     </w:p>
@@ -1388,7 +1550,15 @@
         <w:spacing w:after="0"/>
       </w:pPr>
       <w:r>
-        <w:t>In the above sentence, the relationship between [HEAD ENTITY] and [TAIL ENTITY] entities is: [RELATIONSHIP]</w:t>
+        <w:t xml:space="preserve">In the above sentence, the relationship between [HEAD ENTITY] and [TAIL ENTITY] entities </w:t>
+      </w:r>
+      <w:proofErr w:type="gramStart"/>
+      <w:r>
+        <w:t>is</w:t>
+      </w:r>
+      <w:proofErr w:type="gramEnd"/>
+      <w:r>
+        <w:t>: [RELATIONSHIP]</w:t>
       </w:r>
     </w:p>
     <w:p>
@@ -1446,7 +1616,15 @@
         </w:pBdr>
       </w:pPr>
       <w:r>
-        <w:t>In the given sentence, the relationship between [HEAD ENTITY] and [TAIL ENTITY] entities is:'''</w:t>
+        <w:t xml:space="preserve">In the given sentence, the relationship between [HEAD ENTITY] and [TAIL ENTITY] entities </w:t>
+      </w:r>
+      <w:proofErr w:type="gramStart"/>
+      <w:r>
+        <w:t>is</w:t>
+      </w:r>
+      <w:proofErr w:type="gramEnd"/>
+      <w:r>
+        <w:t>:'''</w:t>
       </w:r>
     </w:p>
     <w:p/>
@@ -1491,7 +1669,39 @@
           <w:u w:val="single"/>
         </w:rPr>
         <w:lastRenderedPageBreak/>
-        <w:t>LLM-RE Framework: TACRED Dataset</w:t>
+        <w:t xml:space="preserve">LLM-RE Framework: </w:t>
+      </w:r>
+      <w:r>
+        <w:rPr>
+          <w:b/>
+          <w:bCs/>
+          <w:sz w:val="28"/>
+          <w:szCs w:val="28"/>
+          <w:u w:val="single"/>
+        </w:rPr>
+        <w:t>Inference Prompts</w:t>
+      </w:r>
+    </w:p>
+    <w:p>
+      <w:pPr>
+        <w:jc w:val="center"/>
+        <w:rPr>
+          <w:b/>
+          <w:bCs/>
+          <w:sz w:val="28"/>
+          <w:szCs w:val="28"/>
+          <w:u w:val="single"/>
+        </w:rPr>
+      </w:pPr>
+      <w:r>
+        <w:rPr>
+          <w:b/>
+          <w:bCs/>
+          <w:sz w:val="28"/>
+          <w:szCs w:val="28"/>
+          <w:u w:val="single"/>
+        </w:rPr>
+        <w:t>TACRED Dataset</w:t>
       </w:r>
     </w:p>
     <w:p>
@@ -1612,7 +1822,21 @@
         <w:rPr>
           <w:rFonts w:cs="Calibri"/>
         </w:rPr>
-        <w:t>You will generate a response in the form: In the given sentence, the relationship between &lt;head-entity&gt; and &lt;tail-entity&gt; entities is: &lt;best from the list of relationships&gt;.</w:t>
+        <w:t xml:space="preserve">You will generate a response in the form: In the given sentence, the relationship between &lt;head-entity&gt; and &lt;tail-entity&gt; entities </w:t>
+      </w:r>
+      <w:proofErr w:type="gramStart"/>
+      <w:r>
+        <w:rPr>
+          <w:rFonts w:cs="Calibri"/>
+        </w:rPr>
+        <w:t>is</w:t>
+      </w:r>
+      <w:proofErr w:type="gramEnd"/>
+      <w:r>
+        <w:rPr>
+          <w:rFonts w:cs="Calibri"/>
+        </w:rPr>
+        <w:t>: &lt;best from the list of relationships&gt;.</w:t>
       </w:r>
     </w:p>
     <w:p>
@@ -1669,7 +1893,21 @@
         <w:rPr>
           <w:rFonts w:cs="Calibri"/>
         </w:rPr>
-        <w:t>In the given sentence, the relationship between [HEAD ENTITY] and [TAIL ENTITY] entities is:'''</w:t>
+        <w:t xml:space="preserve">In the given sentence, the relationship between [HEAD ENTITY] and [TAIL ENTITY] entities </w:t>
+      </w:r>
+      <w:proofErr w:type="gramStart"/>
+      <w:r>
+        <w:rPr>
+          <w:rFonts w:cs="Calibri"/>
+        </w:rPr>
+        <w:t>is</w:t>
+      </w:r>
+      <w:proofErr w:type="gramEnd"/>
+      <w:r>
+        <w:rPr>
+          <w:rFonts w:cs="Calibri"/>
+        </w:rPr>
+        <w:t>:'''</w:t>
       </w:r>
     </w:p>
     <w:p>
@@ -1740,11 +1978,11 @@
         <w:t xml:space="preserve">You are an expert linguist assisting with the Relationship Extraction task. The task is to find out the relationship between the head entity and the tail entity in the given sentence. The assigned relationship must be in </w:t>
       </w:r>
       <w:r>
-        <w:t>(PERSON-TITLE, ORGANIZATION-TOP_MEMBERS_OR_EMPLOYEES, PERSON-EMPLOYEE_OF, ORGANIZATION-ALTERNATE_NAMES, ORGANIZATION-COUNTRY_OF_HEADQUARTERS, PERSON-COUNTRIES_OF_RESIDENCE, ORGANIZATION-CITY_OF_HEADQUARTERS, PERSON-CITIES_OF_RESIDENCE, PERSON-AGE, PERSON-STATE_OR_PROVINCES_OF_RESIDENCE, PERSON-ORIGIN, ORGANIZATION-SUBSIDIARIES, ORGANIZATION-PARENTS, PERSON-SPOUSE, ORGANIZATION-STATE_OR_PROVINCE_OF_HEADQUARTERS, PERSON-CHILDREN, PERSON-OTHER_FAMILY, PERSON-ALTERNATE_NAMES, ORGANIZATION-MEMBERS, PERSON-SIBLINGS, PERSON-SCHOOLS_ATTENDED, PERSON-PARENTS, PERSON-DATE_OF_DEATH, ORGANIZATION-</w:t>
+        <w:t xml:space="preserve">(PERSON-TITLE, ORGANIZATION-TOP_MEMBERS_OR_EMPLOYEES, PERSON-EMPLOYEE_OF, ORGANIZATION-ALTERNATE_NAMES, ORGANIZATION-COUNTRY_OF_HEADQUARTERS, PERSON-COUNTRIES_OF_RESIDENCE, ORGANIZATION-CITY_OF_HEADQUARTERS, PERSON-CITIES_OF_RESIDENCE, PERSON-AGE, PERSON-STATE_OR_PROVINCES_OF_RESIDENCE, PERSON-ORIGIN, ORGANIZATION-SUBSIDIARIES, ORGANIZATION-PARENTS, PERSON-SPOUSE, ORGANIZATION-STATE_OR_PROVINCE_OF_HEADQUARTERS, PERSON-CHILDREN, PERSON-OTHER_FAMILY, </w:t>
       </w:r>
       <w:r>
         <w:lastRenderedPageBreak/>
-        <w:t>MEMBER_OF, ORGANIZATION-FOUNDED_BY, ORGANIZATION-WEBSITE, PERSON-CAUSE_OF_DEATH, ORGANIZATION-POLITICAL_OR_RELIGIOUS_AFFILIATION, ORGANIZATION-FOUNDED, PERSON-CITY_OF_DEATH, ORGANIZATION-SHAREHOLDERS, ORGANIZATION-NUMBER_OF_EMPLOYEES_OR_MEMBERS, PERSON-DATE_OF_BIRTH, PERSON-CITY_OF_BIRTH, PERSON-CHARGES, PERSON-STATE_OR_PROVINCE_OF_DEATH, PERSON-RELIGION, PERSON-STATE_OR_PROVINCE_OF_BIRTH, PERSON-COUNTRY_OF_BIRTH, ORGANIZATION-DISSOLVED, PERSON-COUNTRY_OF_DEATH, NO_RELATION)</w:t>
+        <w:t>PERSON-ALTERNATE_NAMES, ORGANIZATION-MEMBERS, PERSON-SIBLINGS, PERSON-SCHOOLS_ATTENDED, PERSON-PARENTS, PERSON-DATE_OF_DEATH, ORGANIZATION-MEMBER_OF, ORGANIZATION-FOUNDED_BY, ORGANIZATION-WEBSITE, PERSON-CAUSE_OF_DEATH, ORGANIZATION-POLITICAL_OR_RELIGIOUS_AFFILIATION, ORGANIZATION-FOUNDED, PERSON-CITY_OF_DEATH, ORGANIZATION-SHAREHOLDERS, ORGANIZATION-NUMBER_OF_EMPLOYEES_OR_MEMBERS, PERSON-DATE_OF_BIRTH, PERSON-CITY_OF_BIRTH, PERSON-CHARGES, PERSON-STATE_OR_PROVINCE_OF_DEATH, PERSON-RELIGION, PERSON-STATE_OR_PROVINCE_OF_BIRTH, PERSON-COUNTRY_OF_BIRTH, ORGANIZATION-DISSOLVED, PERSON-COUNTRY_OF_DEATH, NO_RELATION)</w:t>
       </w:r>
       <w:r>
         <w:t>.</w:t>
@@ -2062,6 +2300,7 @@
         <w:spacing w:after="0"/>
       </w:pPr>
       <w:r>
+        <w:lastRenderedPageBreak/>
         <w:t>18. PERSON-ALTERNATE_NAMES relationship between entities occurs when a person or organization (Head entity) is identified by an alternate name (Tail entity).</w:t>
       </w:r>
     </w:p>
@@ -2076,333 +2315,333 @@
         <w:spacing w:after="0"/>
       </w:pPr>
       <w:r>
+        <w:t>19. ORGANIZATION-MEMBERS relationship between entities occurs when an organization (Head entity) has another organization or country as a member (Tail entity).</w:t>
+      </w:r>
+    </w:p>
+    <w:p>
+      <w:pPr>
+        <w:pBdr>
+          <w:top w:val="single" w:sz="4" w:space="1" w:color="auto"/>
+          <w:left w:val="single" w:sz="4" w:space="4" w:color="auto"/>
+          <w:bottom w:val="single" w:sz="4" w:space="1" w:color="auto"/>
+          <w:right w:val="single" w:sz="4" w:space="4" w:color="auto"/>
+        </w:pBdr>
+        <w:spacing w:after="0"/>
+      </w:pPr>
+      <w:r>
+        <w:t>20. PERSON-SIBLINGS relationship between entities occurs when a person (Head entity) has another person (Tail entity) as sibling.</w:t>
+      </w:r>
+    </w:p>
+    <w:p>
+      <w:pPr>
+        <w:pBdr>
+          <w:top w:val="single" w:sz="4" w:space="1" w:color="auto"/>
+          <w:left w:val="single" w:sz="4" w:space="4" w:color="auto"/>
+          <w:bottom w:val="single" w:sz="4" w:space="1" w:color="auto"/>
+          <w:right w:val="single" w:sz="4" w:space="4" w:color="auto"/>
+        </w:pBdr>
+        <w:spacing w:after="0"/>
+      </w:pPr>
+      <w:r>
+        <w:t xml:space="preserve">21. PERSON-SCHOOLS_ATTENDED relationship between entities occurs when a person (Head entity) has attended a school (Tail entity) at </w:t>
+      </w:r>
+      <w:r>
+        <w:t>particular</w:t>
+      </w:r>
+      <w:r>
+        <w:t xml:space="preserve"> organization.</w:t>
+      </w:r>
+    </w:p>
+    <w:p>
+      <w:pPr>
+        <w:pBdr>
+          <w:top w:val="single" w:sz="4" w:space="1" w:color="auto"/>
+          <w:left w:val="single" w:sz="4" w:space="4" w:color="auto"/>
+          <w:bottom w:val="single" w:sz="4" w:space="1" w:color="auto"/>
+          <w:right w:val="single" w:sz="4" w:space="4" w:color="auto"/>
+        </w:pBdr>
+        <w:spacing w:after="0"/>
+      </w:pPr>
+      <w:r>
+        <w:t>22. PERSON-PARENTS relationship between entities occurs when a person (Head entity) has another person (Tail entity) as parents.</w:t>
+      </w:r>
+    </w:p>
+    <w:p>
+      <w:pPr>
+        <w:pBdr>
+          <w:top w:val="single" w:sz="4" w:space="1" w:color="auto"/>
+          <w:left w:val="single" w:sz="4" w:space="4" w:color="auto"/>
+          <w:bottom w:val="single" w:sz="4" w:space="1" w:color="auto"/>
+          <w:right w:val="single" w:sz="4" w:space="4" w:color="auto"/>
+        </w:pBdr>
+        <w:spacing w:after="0"/>
+      </w:pPr>
+      <w:r>
+        <w:t>23. PERSON-DATE_OF_DEATH relationship between entities occurs when a person (Head entity) has died on specific day or date (Tail entity).</w:t>
+      </w:r>
+    </w:p>
+    <w:p>
+      <w:pPr>
+        <w:pBdr>
+          <w:top w:val="single" w:sz="4" w:space="1" w:color="auto"/>
+          <w:left w:val="single" w:sz="4" w:space="4" w:color="auto"/>
+          <w:bottom w:val="single" w:sz="4" w:space="1" w:color="auto"/>
+          <w:right w:val="single" w:sz="4" w:space="4" w:color="auto"/>
+        </w:pBdr>
+        <w:spacing w:after="0"/>
+      </w:pPr>
+      <w:r>
+        <w:t>24. ORGANIZATION-MEMBER_OF relationship between entities occurs when an organization (Head entity) is part of another country or organization (Tail entity).</w:t>
+      </w:r>
+    </w:p>
+    <w:p>
+      <w:pPr>
+        <w:pBdr>
+          <w:top w:val="single" w:sz="4" w:space="1" w:color="auto"/>
+          <w:left w:val="single" w:sz="4" w:space="4" w:color="auto"/>
+          <w:bottom w:val="single" w:sz="4" w:space="1" w:color="auto"/>
+          <w:right w:val="single" w:sz="4" w:space="4" w:color="auto"/>
+        </w:pBdr>
+        <w:spacing w:after="0"/>
+      </w:pPr>
+      <w:r>
+        <w:t>25. ORGANIZATION-FOUNDED_BY relationship between entities occurs when an organization (Head entity) is founded by a person (Tail entity).</w:t>
+      </w:r>
+    </w:p>
+    <w:p>
+      <w:pPr>
+        <w:pBdr>
+          <w:top w:val="single" w:sz="4" w:space="1" w:color="auto"/>
+          <w:left w:val="single" w:sz="4" w:space="4" w:color="auto"/>
+          <w:bottom w:val="single" w:sz="4" w:space="1" w:color="auto"/>
+          <w:right w:val="single" w:sz="4" w:space="4" w:color="auto"/>
+        </w:pBdr>
+        <w:spacing w:after="0"/>
+      </w:pPr>
+      <w:r>
+        <w:t>26. ORGANIZATION-WEBSITE relationship between entities occurs when an organization (Head entity) has a website or URL (Tail entity).</w:t>
+      </w:r>
+    </w:p>
+    <w:p>
+      <w:pPr>
+        <w:pBdr>
+          <w:top w:val="single" w:sz="4" w:space="1" w:color="auto"/>
+          <w:left w:val="single" w:sz="4" w:space="4" w:color="auto"/>
+          <w:bottom w:val="single" w:sz="4" w:space="1" w:color="auto"/>
+          <w:right w:val="single" w:sz="4" w:space="4" w:color="auto"/>
+        </w:pBdr>
+        <w:spacing w:after="0"/>
+      </w:pPr>
+      <w:r>
+        <w:t>27. PERSON-CAUSE_OF_DEATH relationship between entities occurs when a person (Head entity) has died because of a cause (Tail entity).</w:t>
+      </w:r>
+    </w:p>
+    <w:p>
+      <w:pPr>
+        <w:pBdr>
+          <w:top w:val="single" w:sz="4" w:space="1" w:color="auto"/>
+          <w:left w:val="single" w:sz="4" w:space="4" w:color="auto"/>
+          <w:bottom w:val="single" w:sz="4" w:space="1" w:color="auto"/>
+          <w:right w:val="single" w:sz="4" w:space="4" w:color="auto"/>
+        </w:pBdr>
+        <w:spacing w:after="0"/>
+      </w:pPr>
+      <w:r>
+        <w:t>28. ORGANIZATION-POLITICAL_OR_RELIGIOUS_AFFILIATION relationship between entities occurs when a person (Head entity) has political or religious affiliation to Political party or Religion (Tail entity).</w:t>
+      </w:r>
+    </w:p>
+    <w:p>
+      <w:pPr>
+        <w:pBdr>
+          <w:top w:val="single" w:sz="4" w:space="1" w:color="auto"/>
+          <w:left w:val="single" w:sz="4" w:space="4" w:color="auto"/>
+          <w:bottom w:val="single" w:sz="4" w:space="1" w:color="auto"/>
+          <w:right w:val="single" w:sz="4" w:space="4" w:color="auto"/>
+        </w:pBdr>
+        <w:spacing w:after="0"/>
+      </w:pPr>
+      <w:r>
+        <w:t>29. ORGANIZATION-FOUNDED relationship between entities occurs when an organization (Head entity) was founded on a specific date or year (Tail entity).</w:t>
+      </w:r>
+    </w:p>
+    <w:p>
+      <w:pPr>
+        <w:pBdr>
+          <w:top w:val="single" w:sz="4" w:space="1" w:color="auto"/>
+          <w:left w:val="single" w:sz="4" w:space="4" w:color="auto"/>
+          <w:bottom w:val="single" w:sz="4" w:space="1" w:color="auto"/>
+          <w:right w:val="single" w:sz="4" w:space="4" w:color="auto"/>
+        </w:pBdr>
+        <w:spacing w:after="0"/>
+      </w:pPr>
+      <w:r>
+        <w:t>30. PERSON-CITY_OF_DEATH relationship between entities occurs when a person (Head entity) has died in a specific city (Tail entity).</w:t>
+      </w:r>
+    </w:p>
+    <w:p>
+      <w:pPr>
+        <w:pBdr>
+          <w:top w:val="single" w:sz="4" w:space="1" w:color="auto"/>
+          <w:left w:val="single" w:sz="4" w:space="4" w:color="auto"/>
+          <w:bottom w:val="single" w:sz="4" w:space="1" w:color="auto"/>
+          <w:right w:val="single" w:sz="4" w:space="4" w:color="auto"/>
+        </w:pBdr>
+        <w:spacing w:after="0"/>
+      </w:pPr>
+      <w:r>
+        <w:t xml:space="preserve">31. ORGANIZATION-SHAREHOLDERS relationship between entities occurs when an organization (Head entity) has a person or organization (Tail entity) as </w:t>
+      </w:r>
+      <w:r>
+        <w:t>shareholders</w:t>
+      </w:r>
+      <w:r>
+        <w:t>.</w:t>
+      </w:r>
+    </w:p>
+    <w:p>
+      <w:pPr>
+        <w:pBdr>
+          <w:top w:val="single" w:sz="4" w:space="1" w:color="auto"/>
+          <w:left w:val="single" w:sz="4" w:space="4" w:color="auto"/>
+          <w:bottom w:val="single" w:sz="4" w:space="1" w:color="auto"/>
+          <w:right w:val="single" w:sz="4" w:space="4" w:color="auto"/>
+        </w:pBdr>
+        <w:spacing w:after="0"/>
+      </w:pPr>
+      <w:r>
+        <w:t>32. ORGANIZATION-NUMBER_OF_EMPLOYEES_OR_MEMBERS relationship between entities occurs when an organization (Head entity) has a given number (Tail entity) of employees or members.</w:t>
+      </w:r>
+    </w:p>
+    <w:p>
+      <w:pPr>
+        <w:pBdr>
+          <w:top w:val="single" w:sz="4" w:space="1" w:color="auto"/>
+          <w:left w:val="single" w:sz="4" w:space="4" w:color="auto"/>
+          <w:bottom w:val="single" w:sz="4" w:space="1" w:color="auto"/>
+          <w:right w:val="single" w:sz="4" w:space="4" w:color="auto"/>
+        </w:pBdr>
+        <w:spacing w:after="0"/>
+      </w:pPr>
+      <w:r>
+        <w:t>33. PERSON-DATE_OF_BIRTH relationship between entities occurs when a person (Head entity) was born on a specific date or year (Tail entity).</w:t>
+      </w:r>
+    </w:p>
+    <w:p>
+      <w:pPr>
+        <w:pBdr>
+          <w:top w:val="single" w:sz="4" w:space="1" w:color="auto"/>
+          <w:left w:val="single" w:sz="4" w:space="4" w:color="auto"/>
+          <w:bottom w:val="single" w:sz="4" w:space="1" w:color="auto"/>
+          <w:right w:val="single" w:sz="4" w:space="4" w:color="auto"/>
+        </w:pBdr>
+        <w:spacing w:after="0"/>
+      </w:pPr>
+      <w:r>
+        <w:t>34. PERSON-CITY_OF_BIRTH relationship between entities occurs when a person (Head entity) was born in a specific city (Tail entity).</w:t>
+      </w:r>
+    </w:p>
+    <w:p>
+      <w:pPr>
+        <w:pBdr>
+          <w:top w:val="single" w:sz="4" w:space="1" w:color="auto"/>
+          <w:left w:val="single" w:sz="4" w:space="4" w:color="auto"/>
+          <w:bottom w:val="single" w:sz="4" w:space="1" w:color="auto"/>
+          <w:right w:val="single" w:sz="4" w:space="4" w:color="auto"/>
+        </w:pBdr>
+        <w:spacing w:after="0"/>
+      </w:pPr>
+      <w:r>
+        <w:t xml:space="preserve">35. PERSON-CHARGES relationship between entities occurs when a person (Head entity) has </w:t>
+      </w:r>
+      <w:r>
+        <w:t>committed</w:t>
+      </w:r>
+      <w:r>
+        <w:t xml:space="preserve"> a specific crime (Tail entity).</w:t>
+      </w:r>
+    </w:p>
+    <w:p>
+      <w:pPr>
+        <w:pBdr>
+          <w:top w:val="single" w:sz="4" w:space="1" w:color="auto"/>
+          <w:left w:val="single" w:sz="4" w:space="4" w:color="auto"/>
+          <w:bottom w:val="single" w:sz="4" w:space="1" w:color="auto"/>
+          <w:right w:val="single" w:sz="4" w:space="4" w:color="auto"/>
+        </w:pBdr>
+        <w:spacing w:after="0"/>
+      </w:pPr>
+      <w:r>
+        <w:t>36. PERSON-STATE_OR_PROVINCE_OF_DEATH relationship between entities occurs when a person (Head entity) has died in a specific state or province (Tail entity).</w:t>
+      </w:r>
+    </w:p>
+    <w:p>
+      <w:pPr>
+        <w:pBdr>
+          <w:top w:val="single" w:sz="4" w:space="1" w:color="auto"/>
+          <w:left w:val="single" w:sz="4" w:space="4" w:color="auto"/>
+          <w:bottom w:val="single" w:sz="4" w:space="1" w:color="auto"/>
+          <w:right w:val="single" w:sz="4" w:space="4" w:color="auto"/>
+        </w:pBdr>
+        <w:spacing w:after="0"/>
+      </w:pPr>
+      <w:r>
+        <w:t>37. PERSON-RELIGION relationship between entities occurs when a person (Head entity) follows a specific religion (Tail entity).</w:t>
+      </w:r>
+    </w:p>
+    <w:p>
+      <w:pPr>
+        <w:pBdr>
+          <w:top w:val="single" w:sz="4" w:space="1" w:color="auto"/>
+          <w:left w:val="single" w:sz="4" w:space="4" w:color="auto"/>
+          <w:bottom w:val="single" w:sz="4" w:space="1" w:color="auto"/>
+          <w:right w:val="single" w:sz="4" w:space="4" w:color="auto"/>
+        </w:pBdr>
+        <w:spacing w:after="0"/>
+      </w:pPr>
+      <w:r>
+        <w:t>38. PERSON-STATE_OR_PROVINCE_OF_BIRTH relationship between entities occurs when a person (Head entity) was born in a specific state or province (Tail entity).</w:t>
+      </w:r>
+    </w:p>
+    <w:p>
+      <w:pPr>
+        <w:pBdr>
+          <w:top w:val="single" w:sz="4" w:space="1" w:color="auto"/>
+          <w:left w:val="single" w:sz="4" w:space="4" w:color="auto"/>
+          <w:bottom w:val="single" w:sz="4" w:space="1" w:color="auto"/>
+          <w:right w:val="single" w:sz="4" w:space="4" w:color="auto"/>
+        </w:pBdr>
+        <w:spacing w:after="0"/>
+      </w:pPr>
+      <w:r>
+        <w:t>39. PERSON-COUNTRY_OF_BIRTH relationship between entities occurs when a person (Head entity) was born in a specific country (Tail entity).</w:t>
+      </w:r>
+    </w:p>
+    <w:p>
+      <w:pPr>
+        <w:pBdr>
+          <w:top w:val="single" w:sz="4" w:space="1" w:color="auto"/>
+          <w:left w:val="single" w:sz="4" w:space="4" w:color="auto"/>
+          <w:bottom w:val="single" w:sz="4" w:space="1" w:color="auto"/>
+          <w:right w:val="single" w:sz="4" w:space="4" w:color="auto"/>
+        </w:pBdr>
+        <w:spacing w:after="0"/>
+      </w:pPr>
+      <w:r>
+        <w:t>40. ORGANIZATION-DISSOLVED relationship between entities occurs when an organization (Head entity) was dissolved on a specific date or year (Tail entity).</w:t>
+      </w:r>
+    </w:p>
+    <w:p>
+      <w:pPr>
+        <w:pBdr>
+          <w:top w:val="single" w:sz="4" w:space="1" w:color="auto"/>
+          <w:left w:val="single" w:sz="4" w:space="4" w:color="auto"/>
+          <w:bottom w:val="single" w:sz="4" w:space="1" w:color="auto"/>
+          <w:right w:val="single" w:sz="4" w:space="4" w:color="auto"/>
+        </w:pBdr>
+        <w:spacing w:after="0"/>
+      </w:pPr>
+      <w:r>
         <w:lastRenderedPageBreak/>
-        <w:t>19. ORGANIZATION-MEMBERS relationship between entities occurs when an organization (Head entity) has another organization or country as a member (Tail entity).</w:t>
-      </w:r>
-    </w:p>
-    <w:p>
-      <w:pPr>
-        <w:pBdr>
-          <w:top w:val="single" w:sz="4" w:space="1" w:color="auto"/>
-          <w:left w:val="single" w:sz="4" w:space="4" w:color="auto"/>
-          <w:bottom w:val="single" w:sz="4" w:space="1" w:color="auto"/>
-          <w:right w:val="single" w:sz="4" w:space="4" w:color="auto"/>
-        </w:pBdr>
-        <w:spacing w:after="0"/>
-      </w:pPr>
-      <w:r>
-        <w:t>20. PERSON-SIBLINGS relationship between entities occurs when a person (Head entity) has another person (Tail entity) as sibling.</w:t>
-      </w:r>
-    </w:p>
-    <w:p>
-      <w:pPr>
-        <w:pBdr>
-          <w:top w:val="single" w:sz="4" w:space="1" w:color="auto"/>
-          <w:left w:val="single" w:sz="4" w:space="4" w:color="auto"/>
-          <w:bottom w:val="single" w:sz="4" w:space="1" w:color="auto"/>
-          <w:right w:val="single" w:sz="4" w:space="4" w:color="auto"/>
-        </w:pBdr>
-        <w:spacing w:after="0"/>
-      </w:pPr>
-      <w:r>
-        <w:t xml:space="preserve">21. PERSON-SCHOOLS_ATTENDED relationship between entities occurs when a person (Head entity) has attended a school (Tail entity) at </w:t>
-      </w:r>
-      <w:r>
-        <w:t>particular</w:t>
-      </w:r>
-      <w:r>
-        <w:t xml:space="preserve"> organization.</w:t>
-      </w:r>
-    </w:p>
-    <w:p>
-      <w:pPr>
-        <w:pBdr>
-          <w:top w:val="single" w:sz="4" w:space="1" w:color="auto"/>
-          <w:left w:val="single" w:sz="4" w:space="4" w:color="auto"/>
-          <w:bottom w:val="single" w:sz="4" w:space="1" w:color="auto"/>
-          <w:right w:val="single" w:sz="4" w:space="4" w:color="auto"/>
-        </w:pBdr>
-        <w:spacing w:after="0"/>
-      </w:pPr>
-      <w:r>
-        <w:t>22. PERSON-PARENTS relationship between entities occurs when a person (Head entity) has another person (Tail entity) as parents.</w:t>
-      </w:r>
-    </w:p>
-    <w:p>
-      <w:pPr>
-        <w:pBdr>
-          <w:top w:val="single" w:sz="4" w:space="1" w:color="auto"/>
-          <w:left w:val="single" w:sz="4" w:space="4" w:color="auto"/>
-          <w:bottom w:val="single" w:sz="4" w:space="1" w:color="auto"/>
-          <w:right w:val="single" w:sz="4" w:space="4" w:color="auto"/>
-        </w:pBdr>
-        <w:spacing w:after="0"/>
-      </w:pPr>
-      <w:r>
-        <w:t>23. PERSON-DATE_OF_DEATH relationship between entities occurs when a person (Head entity) has died on specific day or date (Tail entity).</w:t>
-      </w:r>
-    </w:p>
-    <w:p>
-      <w:pPr>
-        <w:pBdr>
-          <w:top w:val="single" w:sz="4" w:space="1" w:color="auto"/>
-          <w:left w:val="single" w:sz="4" w:space="4" w:color="auto"/>
-          <w:bottom w:val="single" w:sz="4" w:space="1" w:color="auto"/>
-          <w:right w:val="single" w:sz="4" w:space="4" w:color="auto"/>
-        </w:pBdr>
-        <w:spacing w:after="0"/>
-      </w:pPr>
-      <w:r>
-        <w:t>24. ORGANIZATION-MEMBER_OF relationship between entities occurs when an organization (Head entity) is part of another country or organization (Tail entity).</w:t>
-      </w:r>
-    </w:p>
-    <w:p>
-      <w:pPr>
-        <w:pBdr>
-          <w:top w:val="single" w:sz="4" w:space="1" w:color="auto"/>
-          <w:left w:val="single" w:sz="4" w:space="4" w:color="auto"/>
-          <w:bottom w:val="single" w:sz="4" w:space="1" w:color="auto"/>
-          <w:right w:val="single" w:sz="4" w:space="4" w:color="auto"/>
-        </w:pBdr>
-        <w:spacing w:after="0"/>
-      </w:pPr>
-      <w:r>
-        <w:t>25. ORGANIZATION-FOUNDED_BY relationship between entities occurs when an organization (Head entity) is founded by a person (Tail entity).</w:t>
-      </w:r>
-    </w:p>
-    <w:p>
-      <w:pPr>
-        <w:pBdr>
-          <w:top w:val="single" w:sz="4" w:space="1" w:color="auto"/>
-          <w:left w:val="single" w:sz="4" w:space="4" w:color="auto"/>
-          <w:bottom w:val="single" w:sz="4" w:space="1" w:color="auto"/>
-          <w:right w:val="single" w:sz="4" w:space="4" w:color="auto"/>
-        </w:pBdr>
-        <w:spacing w:after="0"/>
-      </w:pPr>
-      <w:r>
-        <w:t>26. ORGANIZATION-WEBSITE relationship between entities occurs when an organization (Head entity) has a website or URL (Tail entity).</w:t>
-      </w:r>
-    </w:p>
-    <w:p>
-      <w:pPr>
-        <w:pBdr>
-          <w:top w:val="single" w:sz="4" w:space="1" w:color="auto"/>
-          <w:left w:val="single" w:sz="4" w:space="4" w:color="auto"/>
-          <w:bottom w:val="single" w:sz="4" w:space="1" w:color="auto"/>
-          <w:right w:val="single" w:sz="4" w:space="4" w:color="auto"/>
-        </w:pBdr>
-        <w:spacing w:after="0"/>
-      </w:pPr>
-      <w:r>
-        <w:t>27. PERSON-CAUSE_OF_DEATH relationship between entities occurs when a person (Head entity) has died because of a cause (Tail entity).</w:t>
-      </w:r>
-    </w:p>
-    <w:p>
-      <w:pPr>
-        <w:pBdr>
-          <w:top w:val="single" w:sz="4" w:space="1" w:color="auto"/>
-          <w:left w:val="single" w:sz="4" w:space="4" w:color="auto"/>
-          <w:bottom w:val="single" w:sz="4" w:space="1" w:color="auto"/>
-          <w:right w:val="single" w:sz="4" w:space="4" w:color="auto"/>
-        </w:pBdr>
-        <w:spacing w:after="0"/>
-      </w:pPr>
-      <w:r>
-        <w:t>28. ORGANIZATION-POLITICAL_OR_RELIGIOUS_AFFILIATION relationship between entities occurs when a person (Head entity) has political or religious affiliation to Political party or Religion (Tail entity).</w:t>
-      </w:r>
-    </w:p>
-    <w:p>
-      <w:pPr>
-        <w:pBdr>
-          <w:top w:val="single" w:sz="4" w:space="1" w:color="auto"/>
-          <w:left w:val="single" w:sz="4" w:space="4" w:color="auto"/>
-          <w:bottom w:val="single" w:sz="4" w:space="1" w:color="auto"/>
-          <w:right w:val="single" w:sz="4" w:space="4" w:color="auto"/>
-        </w:pBdr>
-        <w:spacing w:after="0"/>
-      </w:pPr>
-      <w:r>
-        <w:t>29. ORGANIZATION-FOUNDED relationship between entities occurs when an organization (Head entity) was founded on a specific date or year (Tail entity).</w:t>
-      </w:r>
-    </w:p>
-    <w:p>
-      <w:pPr>
-        <w:pBdr>
-          <w:top w:val="single" w:sz="4" w:space="1" w:color="auto"/>
-          <w:left w:val="single" w:sz="4" w:space="4" w:color="auto"/>
-          <w:bottom w:val="single" w:sz="4" w:space="1" w:color="auto"/>
-          <w:right w:val="single" w:sz="4" w:space="4" w:color="auto"/>
-        </w:pBdr>
-        <w:spacing w:after="0"/>
-      </w:pPr>
-      <w:r>
-        <w:t>30. PERSON-CITY_OF_DEATH relationship between entities occurs when a person (Head entity) has died in a specific city (Tail entity).</w:t>
-      </w:r>
-    </w:p>
-    <w:p>
-      <w:pPr>
-        <w:pBdr>
-          <w:top w:val="single" w:sz="4" w:space="1" w:color="auto"/>
-          <w:left w:val="single" w:sz="4" w:space="4" w:color="auto"/>
-          <w:bottom w:val="single" w:sz="4" w:space="1" w:color="auto"/>
-          <w:right w:val="single" w:sz="4" w:space="4" w:color="auto"/>
-        </w:pBdr>
-        <w:spacing w:after="0"/>
-      </w:pPr>
-      <w:r>
-        <w:t xml:space="preserve">31. ORGANIZATION-SHAREHOLDERS relationship between entities occurs when an organization (Head entity) has a person or organization (Tail entity) as </w:t>
-      </w:r>
-      <w:r>
-        <w:t>shareholders</w:t>
-      </w:r>
-      <w:r>
-        <w:t>.</w:t>
-      </w:r>
-    </w:p>
-    <w:p>
-      <w:pPr>
-        <w:pBdr>
-          <w:top w:val="single" w:sz="4" w:space="1" w:color="auto"/>
-          <w:left w:val="single" w:sz="4" w:space="4" w:color="auto"/>
-          <w:bottom w:val="single" w:sz="4" w:space="1" w:color="auto"/>
-          <w:right w:val="single" w:sz="4" w:space="4" w:color="auto"/>
-        </w:pBdr>
-        <w:spacing w:after="0"/>
-      </w:pPr>
-      <w:r>
-        <w:t>32. ORGANIZATION-NUMBER_OF_EMPLOYEES_OR_MEMBERS relationship between entities occurs when an organization (Head entity) has a given number (Tail entity) of employees or members.</w:t>
-      </w:r>
-    </w:p>
-    <w:p>
-      <w:pPr>
-        <w:pBdr>
-          <w:top w:val="single" w:sz="4" w:space="1" w:color="auto"/>
-          <w:left w:val="single" w:sz="4" w:space="4" w:color="auto"/>
-          <w:bottom w:val="single" w:sz="4" w:space="1" w:color="auto"/>
-          <w:right w:val="single" w:sz="4" w:space="4" w:color="auto"/>
-        </w:pBdr>
-        <w:spacing w:after="0"/>
-      </w:pPr>
-      <w:r>
-        <w:t>33. PERSON-DATE_OF_BIRTH relationship between entities occurs when a person (Head entity) was born on a specific date or year (Tail entity).</w:t>
-      </w:r>
-    </w:p>
-    <w:p>
-      <w:pPr>
-        <w:pBdr>
-          <w:top w:val="single" w:sz="4" w:space="1" w:color="auto"/>
-          <w:left w:val="single" w:sz="4" w:space="4" w:color="auto"/>
-          <w:bottom w:val="single" w:sz="4" w:space="1" w:color="auto"/>
-          <w:right w:val="single" w:sz="4" w:space="4" w:color="auto"/>
-        </w:pBdr>
-        <w:spacing w:after="0"/>
-      </w:pPr>
-      <w:r>
-        <w:t>34. PERSON-CITY_OF_BIRTH relationship between entities occurs when a person (Head entity) was born in a specific city (Tail entity).</w:t>
-      </w:r>
-    </w:p>
-    <w:p>
-      <w:pPr>
-        <w:pBdr>
-          <w:top w:val="single" w:sz="4" w:space="1" w:color="auto"/>
-          <w:left w:val="single" w:sz="4" w:space="4" w:color="auto"/>
-          <w:bottom w:val="single" w:sz="4" w:space="1" w:color="auto"/>
-          <w:right w:val="single" w:sz="4" w:space="4" w:color="auto"/>
-        </w:pBdr>
-        <w:spacing w:after="0"/>
-      </w:pPr>
-      <w:r>
-        <w:t xml:space="preserve">35. PERSON-CHARGES relationship between entities occurs when a person (Head entity) has </w:t>
-      </w:r>
-      <w:r>
-        <w:t>committed</w:t>
-      </w:r>
-      <w:r>
-        <w:t xml:space="preserve"> a specific crime (Tail entity).</w:t>
-      </w:r>
-    </w:p>
-    <w:p>
-      <w:pPr>
-        <w:pBdr>
-          <w:top w:val="single" w:sz="4" w:space="1" w:color="auto"/>
-          <w:left w:val="single" w:sz="4" w:space="4" w:color="auto"/>
-          <w:bottom w:val="single" w:sz="4" w:space="1" w:color="auto"/>
-          <w:right w:val="single" w:sz="4" w:space="4" w:color="auto"/>
-        </w:pBdr>
-        <w:spacing w:after="0"/>
-      </w:pPr>
-      <w:r>
-        <w:t>36. PERSON-STATE_OR_PROVINCE_OF_DEATH relationship between entities occurs when a person (Head entity) has died in a specific state or province (Tail entity).</w:t>
-      </w:r>
-    </w:p>
-    <w:p>
-      <w:pPr>
-        <w:pBdr>
-          <w:top w:val="single" w:sz="4" w:space="1" w:color="auto"/>
-          <w:left w:val="single" w:sz="4" w:space="4" w:color="auto"/>
-          <w:bottom w:val="single" w:sz="4" w:space="1" w:color="auto"/>
-          <w:right w:val="single" w:sz="4" w:space="4" w:color="auto"/>
-        </w:pBdr>
-        <w:spacing w:after="0"/>
-      </w:pPr>
-      <w:r>
-        <w:t>37. PERSON-RELIGION relationship between entities occurs when a person (Head entity) follows a specific religion (Tail entity).</w:t>
-      </w:r>
-    </w:p>
-    <w:p>
-      <w:pPr>
-        <w:pBdr>
-          <w:top w:val="single" w:sz="4" w:space="1" w:color="auto"/>
-          <w:left w:val="single" w:sz="4" w:space="4" w:color="auto"/>
-          <w:bottom w:val="single" w:sz="4" w:space="1" w:color="auto"/>
-          <w:right w:val="single" w:sz="4" w:space="4" w:color="auto"/>
-        </w:pBdr>
-        <w:spacing w:after="0"/>
-      </w:pPr>
-      <w:r>
-        <w:t>38. PERSON-STATE_OR_PROVINCE_OF_BIRTH relationship between entities occurs when a person (Head entity) was born in a specific state or province (Tail entity).</w:t>
-      </w:r>
-    </w:p>
-    <w:p>
-      <w:pPr>
-        <w:pBdr>
-          <w:top w:val="single" w:sz="4" w:space="1" w:color="auto"/>
-          <w:left w:val="single" w:sz="4" w:space="4" w:color="auto"/>
-          <w:bottom w:val="single" w:sz="4" w:space="1" w:color="auto"/>
-          <w:right w:val="single" w:sz="4" w:space="4" w:color="auto"/>
-        </w:pBdr>
-        <w:spacing w:after="0"/>
-      </w:pPr>
-      <w:r>
-        <w:t>39. PERSON-COUNTRY_OF_BIRTH relationship between entities occurs when a person (Head entity) was born in a specific country (Tail entity).</w:t>
-      </w:r>
-    </w:p>
-    <w:p>
-      <w:pPr>
-        <w:pBdr>
-          <w:top w:val="single" w:sz="4" w:space="1" w:color="auto"/>
-          <w:left w:val="single" w:sz="4" w:space="4" w:color="auto"/>
-          <w:bottom w:val="single" w:sz="4" w:space="1" w:color="auto"/>
-          <w:right w:val="single" w:sz="4" w:space="4" w:color="auto"/>
-        </w:pBdr>
-        <w:spacing w:after="0"/>
-      </w:pPr>
-      <w:r>
-        <w:t>40. ORGANIZATION-DISSOLVED relationship between entities occurs when an organization (Head entity) was dissolved on a specific date or year (Tail entity).</w:t>
-      </w:r>
-    </w:p>
-    <w:p>
-      <w:pPr>
-        <w:pBdr>
-          <w:top w:val="single" w:sz="4" w:space="1" w:color="auto"/>
-          <w:left w:val="single" w:sz="4" w:space="4" w:color="auto"/>
-          <w:bottom w:val="single" w:sz="4" w:space="1" w:color="auto"/>
-          <w:right w:val="single" w:sz="4" w:space="4" w:color="auto"/>
-        </w:pBdr>
-        <w:spacing w:after="0"/>
-      </w:pPr>
-      <w:r>
         <w:t>41. PERSON-COUNTRY_OF_DEATH relationship between entities occurs when a person (Head entity) has died in a specific country (Tail entity).</w:t>
       </w:r>
     </w:p>
@@ -2417,7 +2656,6 @@
         <w:spacing w:after="0"/>
       </w:pPr>
       <w:r>
-        <w:lastRenderedPageBreak/>
         <w:t>42. NO_RELATION relationship between entities occurs when the relationship between the Head entity and the Tail entity cannot be categorised in one of the above relationships.</w:t>
       </w:r>
     </w:p>
@@ -2444,7 +2682,15 @@
         </w:pBdr>
       </w:pPr>
       <w:r>
-        <w:t xml:space="preserve">You will generate response in the form: In the given sentence, the relationship between &lt;head-entity&gt; and &lt;tail-entity&gt; entities is: &lt;best from the list of relationships&gt;. </w:t>
+        <w:t xml:space="preserve">You will generate response in the form: In the given sentence, the relationship between &lt;head-entity&gt; and &lt;tail-entity&gt; entities </w:t>
+      </w:r>
+      <w:proofErr w:type="gramStart"/>
+      <w:r>
+        <w:t>is</w:t>
+      </w:r>
+      <w:proofErr w:type="gramEnd"/>
+      <w:r>
+        <w:t xml:space="preserve">: &lt;best from the list of relationships&gt;. </w:t>
       </w:r>
     </w:p>
     <w:p>
@@ -2489,7 +2735,15 @@
         </w:pBdr>
       </w:pPr>
       <w:r>
-        <w:t>In the given sentence, the relationship between [HEAD ENTITY] and [TAIL ENTITY] entities is:'''</w:t>
+        <w:t xml:space="preserve">In the given sentence, the relationship between [HEAD ENTITY] and [TAIL ENTITY] entities </w:t>
+      </w:r>
+      <w:proofErr w:type="gramStart"/>
+      <w:r>
+        <w:t>is</w:t>
+      </w:r>
+      <w:proofErr w:type="gramEnd"/>
+      <w:r>
+        <w:t>:'''</w:t>
       </w:r>
     </w:p>
     <w:p>
@@ -2575,7 +2829,15 @@
         </w:pBdr>
       </w:pPr>
       <w:r>
-        <w:t xml:space="preserve">You will generate response in the form: In the given sentence, the relationship between &lt;head-entity&gt; and &lt;tail-entity&gt; entities is: &lt;best from the list of relationships&gt;. </w:t>
+        <w:t xml:space="preserve">You will generate response in the form: In the given sentence, the relationship between &lt;head-entity&gt; and &lt;tail-entity&gt; entities </w:t>
+      </w:r>
+      <w:proofErr w:type="gramStart"/>
+      <w:r>
+        <w:t>is</w:t>
+      </w:r>
+      <w:proofErr w:type="gramEnd"/>
+      <w:r>
+        <w:t xml:space="preserve">: &lt;best from the list of relationships&gt;. </w:t>
       </w:r>
     </w:p>
     <w:p>
@@ -2648,20 +2910,29 @@
         </w:pBdr>
       </w:pPr>
       <w:r>
-        <w:t>In the above sentence, the relationship between [HEAD ENTITY] and [TAIL ENTITY] entities is: [RELATIONSHIP]</w:t>
-      </w:r>
-    </w:p>
-    <w:p>
-      <w:pPr>
-        <w:pBdr>
-          <w:top w:val="single" w:sz="4" w:space="1" w:color="auto"/>
-          <w:left w:val="single" w:sz="4" w:space="4" w:color="auto"/>
-          <w:bottom w:val="single" w:sz="4" w:space="1" w:color="auto"/>
-          <w:right w:val="single" w:sz="4" w:space="4" w:color="auto"/>
-        </w:pBdr>
-        <w:spacing w:after="0"/>
-      </w:pPr>
-      <w:r>
+        <w:t xml:space="preserve">In the above sentence, the relationship between [HEAD ENTITY] and [TAIL ENTITY] entities </w:t>
+      </w:r>
+      <w:proofErr w:type="gramStart"/>
+      <w:r>
+        <w:t>is</w:t>
+      </w:r>
+      <w:proofErr w:type="gramEnd"/>
+      <w:r>
+        <w:t>: [RELATIONSHIP]</w:t>
+      </w:r>
+    </w:p>
+    <w:p>
+      <w:pPr>
+        <w:pBdr>
+          <w:top w:val="single" w:sz="4" w:space="1" w:color="auto"/>
+          <w:left w:val="single" w:sz="4" w:space="4" w:color="auto"/>
+          <w:bottom w:val="single" w:sz="4" w:space="1" w:color="auto"/>
+          <w:right w:val="single" w:sz="4" w:space="4" w:color="auto"/>
+        </w:pBdr>
+        <w:spacing w:after="0"/>
+      </w:pPr>
+      <w:r>
+        <w:lastRenderedPageBreak/>
         <w:t>Example-2:</w:t>
       </w:r>
     </w:p>
@@ -2695,8 +2966,15 @@
         </w:pBdr>
       </w:pPr>
       <w:r>
-        <w:lastRenderedPageBreak/>
-        <w:t>In the above sentence, the relationship between [HEAD ENTITY] and [TAIL ENTITY] entities is: [RELATIONSHIP]</w:t>
+        <w:t xml:space="preserve">In the above sentence, the relationship between [HEAD ENTITY] and [TAIL ENTITY] entities </w:t>
+      </w:r>
+      <w:proofErr w:type="gramStart"/>
+      <w:r>
+        <w:t>is</w:t>
+      </w:r>
+      <w:proofErr w:type="gramEnd"/>
+      <w:r>
+        <w:t>: [RELATIONSHIP]</w:t>
       </w:r>
     </w:p>
     <w:p>
@@ -2743,7 +3021,15 @@
         </w:pBdr>
       </w:pPr>
       <w:r>
-        <w:t>In the above sentence, the relationship between [HEAD ENTITY] and [TAIL ENTITY] entities is: [RELATIONSHIP]</w:t>
+        <w:t xml:space="preserve">In the above sentence, the relationship between [HEAD ENTITY] and [TAIL ENTITY] entities </w:t>
+      </w:r>
+      <w:proofErr w:type="gramStart"/>
+      <w:r>
+        <w:t>is</w:t>
+      </w:r>
+      <w:proofErr w:type="gramEnd"/>
+      <w:r>
+        <w:t>: [RELATIONSHIP]</w:t>
       </w:r>
     </w:p>
     <w:p>
@@ -2790,7 +3076,15 @@
         </w:pBdr>
       </w:pPr>
       <w:r>
-        <w:t>In the above sentence, the relationship between [HEAD ENTITY] and [TAIL ENTITY] entities is: [RELATIONSHIP]</w:t>
+        <w:t xml:space="preserve">In the above sentence, the relationship between [HEAD ENTITY] and [TAIL ENTITY] entities </w:t>
+      </w:r>
+      <w:proofErr w:type="gramStart"/>
+      <w:r>
+        <w:t>is</w:t>
+      </w:r>
+      <w:proofErr w:type="gramEnd"/>
+      <w:r>
+        <w:t>: [RELATIONSHIP]</w:t>
       </w:r>
     </w:p>
     <w:p>
@@ -2837,7 +3131,15 @@
         </w:pBdr>
       </w:pPr>
       <w:r>
-        <w:t>In the above sentence, the relationship between [HEAD ENTITY] and [TAIL ENTITY] entities is: [RELATIONSHIP]</w:t>
+        <w:t xml:space="preserve">In the above sentence, the relationship between [HEAD ENTITY] and [TAIL ENTITY] entities </w:t>
+      </w:r>
+      <w:proofErr w:type="gramStart"/>
+      <w:r>
+        <w:t>is</w:t>
+      </w:r>
+      <w:proofErr w:type="gramEnd"/>
+      <w:r>
+        <w:t>: [RELATIONSHIP]</w:t>
       </w:r>
     </w:p>
     <w:p>
@@ -2895,7 +3197,15 @@
         </w:pBdr>
       </w:pPr>
       <w:r>
-        <w:t>In the given sentence, the relationship between [HEAD ENTITY] and [TAIL ENTITY] entities is:'''</w:t>
+        <w:t xml:space="preserve">In the given sentence, the relationship between [HEAD ENTITY] and [TAIL ENTITY] entities </w:t>
+      </w:r>
+      <w:proofErr w:type="gramStart"/>
+      <w:r>
+        <w:t>is</w:t>
+      </w:r>
+      <w:proofErr w:type="gramEnd"/>
+      <w:r>
+        <w:t>:'''</w:t>
       </w:r>
     </w:p>
     <w:p>
@@ -2982,6 +3292,7 @@
         </w:pBdr>
       </w:pPr>
       <w:r>
+        <w:lastRenderedPageBreak/>
         <w:t>When the relationship between the head entity and the tail entity cannot be identified from one of the relationships listed above, you must assign the relationship as NO_RELATION.</w:t>
       </w:r>
     </w:p>
@@ -2995,8 +3306,15 @@
         </w:pBdr>
       </w:pPr>
       <w:r>
-        <w:lastRenderedPageBreak/>
-        <w:t xml:space="preserve">You will generate response in the form: In the given sentence, the relationship between &lt;head-entity&gt; and &lt;tail-entity&gt; entities is: &lt;best from the list of relationships&gt;. </w:t>
+        <w:t xml:space="preserve">You will generate response in the form: In the given sentence, the relationship between &lt;head-entity&gt; and &lt;tail-entity&gt; entities </w:t>
+      </w:r>
+      <w:proofErr w:type="gramStart"/>
+      <w:r>
+        <w:t>is</w:t>
+      </w:r>
+      <w:proofErr w:type="gramEnd"/>
+      <w:r>
+        <w:t xml:space="preserve">: &lt;best from the list of relationships&gt;. </w:t>
       </w:r>
     </w:p>
     <w:p>
@@ -3070,7 +3388,15 @@
         <w:spacing w:after="0"/>
       </w:pPr>
       <w:r>
-        <w:t>In the above sentence, the relationship between [HEAD ENTITY] and [TAIL ENTITY] entities is: [RELATIONSHIP]</w:t>
+        <w:t xml:space="preserve">In the above sentence, the relationship between [HEAD ENTITY] and [TAIL ENTITY] entities </w:t>
+      </w:r>
+      <w:proofErr w:type="gramStart"/>
+      <w:r>
+        <w:t>is</w:t>
+      </w:r>
+      <w:proofErr w:type="gramEnd"/>
+      <w:r>
+        <w:t>: [RELATIONSHIP]</w:t>
       </w:r>
     </w:p>
     <w:p>
@@ -3131,7 +3457,15 @@
         <w:spacing w:after="0"/>
       </w:pPr>
       <w:r>
-        <w:t>In the above sentence, the relationship between [HEAD ENTITY] and [TAIL ENTITY] entities is: [RELATIONSHIP]</w:t>
+        <w:t xml:space="preserve">In the above sentence, the relationship between [HEAD ENTITY] and [TAIL ENTITY] entities </w:t>
+      </w:r>
+      <w:proofErr w:type="gramStart"/>
+      <w:r>
+        <w:t>is</w:t>
+      </w:r>
+      <w:proofErr w:type="gramEnd"/>
+      <w:r>
+        <w:t>: [RELATIONSHIP]</w:t>
       </w:r>
     </w:p>
     <w:p>
@@ -3192,7 +3526,15 @@
         <w:spacing w:after="0"/>
       </w:pPr>
       <w:r>
-        <w:t>In the above sentence, the relationship between [HEAD ENTITY] and [TAIL ENTITY] entities is: [RELATIONSHIP]</w:t>
+        <w:t xml:space="preserve">In the above sentence, the relationship between [HEAD ENTITY] and [TAIL ENTITY] entities </w:t>
+      </w:r>
+      <w:proofErr w:type="gramStart"/>
+      <w:r>
+        <w:t>is</w:t>
+      </w:r>
+      <w:proofErr w:type="gramEnd"/>
+      <w:r>
+        <w:t>: [RELATIONSHIP]</w:t>
       </w:r>
     </w:p>
     <w:p>
@@ -3253,7 +3595,15 @@
         <w:spacing w:after="0"/>
       </w:pPr>
       <w:r>
-        <w:t>In the above sentence, the relationship between [HEAD ENTITY] and [TAIL ENTITY] entities is: [RELATIONSHIP]</w:t>
+        <w:t xml:space="preserve">In the above sentence, the relationship between [HEAD ENTITY] and [TAIL ENTITY] entities </w:t>
+      </w:r>
+      <w:proofErr w:type="gramStart"/>
+      <w:r>
+        <w:t>is</w:t>
+      </w:r>
+      <w:proofErr w:type="gramEnd"/>
+      <w:r>
+        <w:t>: [RELATIONSHIP]</w:t>
       </w:r>
     </w:p>
     <w:p>
@@ -3314,7 +3664,15 @@
         <w:spacing w:after="0"/>
       </w:pPr>
       <w:r>
-        <w:t>In the above sentence, the relationship between [HEAD ENTITY] and [TAIL ENTITY] entities is: [RELATIONSHIP]</w:t>
+        <w:t xml:space="preserve">In the above sentence, the relationship between [HEAD ENTITY] and [TAIL ENTITY] entities </w:t>
+      </w:r>
+      <w:proofErr w:type="gramStart"/>
+      <w:r>
+        <w:t>is</w:t>
+      </w:r>
+      <w:proofErr w:type="gramEnd"/>
+      <w:r>
+        <w:t>: [RELATIONSHIP]</w:t>
       </w:r>
     </w:p>
     <w:p>
@@ -3372,7 +3730,15 @@
         </w:pBdr>
       </w:pPr>
       <w:r>
-        <w:t>In the given sentence, the relationship between [HEAD ENTITY] and [TAIL ENTITY] entities is:'''</w:t>
+        <w:t xml:space="preserve">In the given sentence, the relationship between [HEAD ENTITY] and [TAIL ENTITY] entities </w:t>
+      </w:r>
+      <w:proofErr w:type="gramStart"/>
+      <w:r>
+        <w:t>is</w:t>
+      </w:r>
+      <w:proofErr w:type="gramEnd"/>
+      <w:r>
+        <w:t>:'''</w:t>
       </w:r>
     </w:p>
     <w:p>
@@ -3416,7 +3782,39 @@
           <w:u w:val="single"/>
         </w:rPr>
         <w:lastRenderedPageBreak/>
-        <w:t>LLM-RE Framework: RE-TACRED Dataset</w:t>
+        <w:t xml:space="preserve">LLM-RE Framework: </w:t>
+      </w:r>
+      <w:r>
+        <w:rPr>
+          <w:b/>
+          <w:bCs/>
+          <w:sz w:val="28"/>
+          <w:szCs w:val="28"/>
+          <w:u w:val="single"/>
+        </w:rPr>
+        <w:t>Inference Prompts</w:t>
+      </w:r>
+    </w:p>
+    <w:p>
+      <w:pPr>
+        <w:jc w:val="center"/>
+        <w:rPr>
+          <w:b/>
+          <w:bCs/>
+          <w:sz w:val="28"/>
+          <w:szCs w:val="28"/>
+          <w:u w:val="single"/>
+        </w:rPr>
+      </w:pPr>
+      <w:r>
+        <w:rPr>
+          <w:b/>
+          <w:bCs/>
+          <w:sz w:val="28"/>
+          <w:szCs w:val="28"/>
+          <w:u w:val="single"/>
+        </w:rPr>
+        <w:t>RE-TACRED Dataset</w:t>
       </w:r>
     </w:p>
     <w:p>
@@ -3549,7 +3947,21 @@
         <w:rPr>
           <w:rFonts w:cs="Calibri"/>
         </w:rPr>
-        <w:t>You will generate a response in the form: In the given sentence, the relationship between &lt;head-entity&gt; and &lt;tail-entity&gt; entities is: &lt;best from the list of relationships&gt;.</w:t>
+        <w:t xml:space="preserve">You will generate a response in the form: In the given sentence, the relationship between &lt;head-entity&gt; and &lt;tail-entity&gt; entities </w:t>
+      </w:r>
+      <w:proofErr w:type="gramStart"/>
+      <w:r>
+        <w:rPr>
+          <w:rFonts w:cs="Calibri"/>
+        </w:rPr>
+        <w:t>is</w:t>
+      </w:r>
+      <w:proofErr w:type="gramEnd"/>
+      <w:r>
+        <w:rPr>
+          <w:rFonts w:cs="Calibri"/>
+        </w:rPr>
+        <w:t>: &lt;best from the list of relationships&gt;.</w:t>
       </w:r>
     </w:p>
     <w:p>
@@ -3636,7 +4048,21 @@
         <w:rPr>
           <w:rFonts w:cs="Calibri"/>
         </w:rPr>
-        <w:t xml:space="preserve"> entities is:'''</w:t>
+        <w:t xml:space="preserve"> entities </w:t>
+      </w:r>
+      <w:proofErr w:type="gramStart"/>
+      <w:r>
+        <w:rPr>
+          <w:rFonts w:cs="Calibri"/>
+        </w:rPr>
+        <w:t>is</w:t>
+      </w:r>
+      <w:proofErr w:type="gramEnd"/>
+      <w:r>
+        <w:rPr>
+          <w:rFonts w:cs="Calibri"/>
+        </w:rPr>
+        <w:t>:'''</w:t>
       </w:r>
     </w:p>
     <w:p>
@@ -3708,11 +4134,11 @@
         </w:pBdr>
       </w:pPr>
       <w:r>
-        <w:t xml:space="preserve">You are an expert linguist assisting with the Relationship Extraction task. The task is to find out the relationship between the head entity and the tail entity in the given sentence. The assigned relationship must be in (PERSON-TITLE, ORGANIZATION-TOP_MEMBERS_OR_EMPLOYEES, PERSON-EMPLOYEE_OF, ORGANIZATION-ALTERNATE_NAMES, ORGANIZATION-COUNTRY_OF_BRANCH, PERSON-COUNTRIES_OF_RESIDENCE, ORGANIZATION-CITY_OF_BRANCH, PERSON-CITIES_OF_RESIDENCE, PERSON-AGE, PERSON-STATE_OR_PROVINCES_OF_RESIDENCE, PERSON-ORIGIN, PERSON-SPOUSE, ORGANIZATION-STATE_OR_PROVINCE_OF_BRANCH, PERSON-CHILDREN, PERSON-OTHER_FAMILY, PERSON-IDENTITY, ORGANIZATION-MEMBERS, PERSON-SIBLINGS, PERSON-SCHOOLS_ATTENDED, PERSON-PARENTS, PERSON-DATE_OF_DEATH, ORGANIZATION-MEMBER_OF, ORGANIZATION-FOUNDED_BY, ORGANIZATION-WEBSITE, PERSON-CAUSE_OF_DEATH, ORGANIZATION-POLITICAL_OR_RELIGIOUS_AFFILIATION, </w:t>
+        <w:t>You are an expert linguist assisting with the Relationship Extraction task. The task is to find out the relationship between the head entity and the tail entity in the given sentence. The assigned relationship must be in (PERSON-TITLE, ORGANIZATION-TOP_MEMBERS_OR_EMPLOYEES, PERSON-EMPLOYEE_OF, ORGANIZATION-ALTERNATE_NAMES, ORGANIZATION-COUNTRY_OF_BRANCH, PERSON-COUNTRIES_OF_RESIDENCE, ORGANIZATION-CITY_OF_BRANCH, PERSON-CITIES_OF_RESIDENCE, PERSON-AGE, PERSON-STATE_OR_PROVINCES_OF_RESIDENCE, PERSON-ORIGIN, PERSON-SPOUSE, ORGANIZATION-STATE_OR_PROVINCE_OF_BRANCH, PERSON-CHILDREN, PERSON-OTHER_FAMILY, PERSON-IDENTITY, ORGANIZATION-MEMBERS, PERSON-SIBLINGS, PERSON-SCHOOLS_ATTENDED, PERSON-PARENTS, PERSON-DATE_OF_DEATH, ORGANIZATION-</w:t>
       </w:r>
       <w:r>
         <w:lastRenderedPageBreak/>
-        <w:t>ORGANIZATION-FOUNDED, PERSON-CITY_OF_DEATH, ORGANIZATION-SHAREHOLDERS, ORGANIZATION-NUMBER_OF_EMPLOYEES_OR_MEMBERS, PERSON-DATE_OF_BIRTH, PERSON-CITY_OF_BIRTH, PERSON-CHARGES, PERSON-STATE_OR_PROVINCE_OF_DEATH, PERSON-RELIGION, PERSON-STATE_OR_PROVINCE_OF_BIRTH, PERSON-COUNTRY_OF_BIRTH, ORGANIZATION-DISSOLVED, PERSON-COUNTRY_OF_DEATH, NO_RELATION).</w:t>
+        <w:t>MEMBER_OF, ORGANIZATION-FOUNDED_BY, ORGANIZATION-WEBSITE, PERSON-CAUSE_OF_DEATH, ORGANIZATION-POLITICAL_OR_RELIGIOUS_AFFILIATION, ORGANIZATION-FOUNDED, PERSON-CITY_OF_DEATH, ORGANIZATION-SHAREHOLDERS, ORGANIZATION-NUMBER_OF_EMPLOYEES_OR_MEMBERS, PERSON-DATE_OF_BIRTH, PERSON-CITY_OF_BIRTH, PERSON-CHARGES, PERSON-STATE_OR_PROVINCE_OF_DEATH, PERSON-RELIGION, PERSON-STATE_OR_PROVINCE_OF_BIRTH, PERSON-COUNTRY_OF_BIRTH, ORGANIZATION-DISSOLVED, PERSON-COUNTRY_OF_DEATH, NO_RELATION).</w:t>
       </w:r>
     </w:p>
     <w:p>
@@ -4028,6 +4454,7 @@
         <w:spacing w:after="0"/>
       </w:pPr>
       <w:r>
+        <w:lastRenderedPageBreak/>
         <w:t xml:space="preserve">19. PERSON-SCHOOLS_ATTENDED relationship between entities occurs when a person (Head entity) has attended a school (Tail entity) at </w:t>
       </w:r>
       <w:r>
@@ -4048,339 +4475,346 @@
         <w:spacing w:after="0"/>
       </w:pPr>
       <w:r>
+        <w:t>20. PERSON-PARENTS relationship between entities occurs when a person (Head entity) has another person (Tail entity) as parents.</w:t>
+      </w:r>
+    </w:p>
+    <w:p>
+      <w:pPr>
+        <w:pBdr>
+          <w:top w:val="single" w:sz="4" w:space="1" w:color="auto"/>
+          <w:left w:val="single" w:sz="4" w:space="4" w:color="auto"/>
+          <w:bottom w:val="single" w:sz="4" w:space="1" w:color="auto"/>
+          <w:right w:val="single" w:sz="4" w:space="4" w:color="auto"/>
+        </w:pBdr>
+        <w:spacing w:after="0"/>
+      </w:pPr>
+      <w:r>
+        <w:t>21. PERSON-DATE_OF_DEATH relationship between entities occurs when a person (Head entity) has died on specific day or date (Tail entity).</w:t>
+      </w:r>
+    </w:p>
+    <w:p>
+      <w:pPr>
+        <w:pBdr>
+          <w:top w:val="single" w:sz="4" w:space="1" w:color="auto"/>
+          <w:left w:val="single" w:sz="4" w:space="4" w:color="auto"/>
+          <w:bottom w:val="single" w:sz="4" w:space="1" w:color="auto"/>
+          <w:right w:val="single" w:sz="4" w:space="4" w:color="auto"/>
+        </w:pBdr>
+        <w:spacing w:after="0"/>
+      </w:pPr>
+      <w:r>
+        <w:t>22. ORGANIZATION-MEMBER_OF relationship between entities occurs when an organization (Head entity) is part of another country or organization (Tail entity).</w:t>
+      </w:r>
+    </w:p>
+    <w:p>
+      <w:pPr>
+        <w:pBdr>
+          <w:top w:val="single" w:sz="4" w:space="1" w:color="auto"/>
+          <w:left w:val="single" w:sz="4" w:space="4" w:color="auto"/>
+          <w:bottom w:val="single" w:sz="4" w:space="1" w:color="auto"/>
+          <w:right w:val="single" w:sz="4" w:space="4" w:color="auto"/>
+        </w:pBdr>
+        <w:spacing w:after="0"/>
+      </w:pPr>
+      <w:r>
+        <w:t>23. ORGANIZATION-FOUNDED_BY relationship between entities occurs when an organization (Head entity) is founded by a person (Tail entity).</w:t>
+      </w:r>
+    </w:p>
+    <w:p>
+      <w:pPr>
+        <w:pBdr>
+          <w:top w:val="single" w:sz="4" w:space="1" w:color="auto"/>
+          <w:left w:val="single" w:sz="4" w:space="4" w:color="auto"/>
+          <w:bottom w:val="single" w:sz="4" w:space="1" w:color="auto"/>
+          <w:right w:val="single" w:sz="4" w:space="4" w:color="auto"/>
+        </w:pBdr>
+        <w:spacing w:after="0"/>
+      </w:pPr>
+      <w:r>
+        <w:t>24. ORGANIZATION-WEBSITE relationship between entities occurs when an organization (Head entity) has a website or URL (Tail entity).</w:t>
+      </w:r>
+    </w:p>
+    <w:p>
+      <w:pPr>
+        <w:pBdr>
+          <w:top w:val="single" w:sz="4" w:space="1" w:color="auto"/>
+          <w:left w:val="single" w:sz="4" w:space="4" w:color="auto"/>
+          <w:bottom w:val="single" w:sz="4" w:space="1" w:color="auto"/>
+          <w:right w:val="single" w:sz="4" w:space="4" w:color="auto"/>
+        </w:pBdr>
+        <w:spacing w:after="0"/>
+      </w:pPr>
+      <w:r>
+        <w:t>25. PERSON-CAUSE_OF_DEATH relationship between entities occurs when a person (Head entity) has died because of a cause (Tail entity).</w:t>
+      </w:r>
+    </w:p>
+    <w:p>
+      <w:pPr>
+        <w:pBdr>
+          <w:top w:val="single" w:sz="4" w:space="1" w:color="auto"/>
+          <w:left w:val="single" w:sz="4" w:space="4" w:color="auto"/>
+          <w:bottom w:val="single" w:sz="4" w:space="1" w:color="auto"/>
+          <w:right w:val="single" w:sz="4" w:space="4" w:color="auto"/>
+        </w:pBdr>
+        <w:spacing w:after="0"/>
+      </w:pPr>
+      <w:r>
+        <w:t>26. ORGANIZATION-POLITICAL_OR_RELIGIOUS_AFFILIATION relationship between entities occurs when a person (Head entity) has political or religious affiliation to Political party or Religion (Tail entity).</w:t>
+      </w:r>
+    </w:p>
+    <w:p>
+      <w:pPr>
+        <w:pBdr>
+          <w:top w:val="single" w:sz="4" w:space="1" w:color="auto"/>
+          <w:left w:val="single" w:sz="4" w:space="4" w:color="auto"/>
+          <w:bottom w:val="single" w:sz="4" w:space="1" w:color="auto"/>
+          <w:right w:val="single" w:sz="4" w:space="4" w:color="auto"/>
+        </w:pBdr>
+        <w:spacing w:after="0"/>
+      </w:pPr>
+      <w:r>
+        <w:t>27. ORGANIZATION-FOUNDED relationship between entities occurs when an organization (Head entity) was founded on a specific date or year (Tail entity).</w:t>
+      </w:r>
+    </w:p>
+    <w:p>
+      <w:pPr>
+        <w:pBdr>
+          <w:top w:val="single" w:sz="4" w:space="1" w:color="auto"/>
+          <w:left w:val="single" w:sz="4" w:space="4" w:color="auto"/>
+          <w:bottom w:val="single" w:sz="4" w:space="1" w:color="auto"/>
+          <w:right w:val="single" w:sz="4" w:space="4" w:color="auto"/>
+        </w:pBdr>
+        <w:spacing w:after="0"/>
+      </w:pPr>
+      <w:r>
+        <w:t>28. PERSON-CITY_OF_DEATH relationship between entities occurs when a person (Head entity) has died in a specific city (Tail entity).</w:t>
+      </w:r>
+    </w:p>
+    <w:p>
+      <w:pPr>
+        <w:pBdr>
+          <w:top w:val="single" w:sz="4" w:space="1" w:color="auto"/>
+          <w:left w:val="single" w:sz="4" w:space="4" w:color="auto"/>
+          <w:bottom w:val="single" w:sz="4" w:space="1" w:color="auto"/>
+          <w:right w:val="single" w:sz="4" w:space="4" w:color="auto"/>
+        </w:pBdr>
+        <w:spacing w:after="0"/>
+      </w:pPr>
+      <w:r>
+        <w:t xml:space="preserve">29. ORGANIZATION-SHAREHOLDERS relationship between entities occurs when an organization (Head entity) has a person or organization (Tail entity) as </w:t>
+      </w:r>
+      <w:r>
+        <w:t>shareholders</w:t>
+      </w:r>
+      <w:r>
+        <w:t>.</w:t>
+      </w:r>
+    </w:p>
+    <w:p>
+      <w:pPr>
+        <w:pBdr>
+          <w:top w:val="single" w:sz="4" w:space="1" w:color="auto"/>
+          <w:left w:val="single" w:sz="4" w:space="4" w:color="auto"/>
+          <w:bottom w:val="single" w:sz="4" w:space="1" w:color="auto"/>
+          <w:right w:val="single" w:sz="4" w:space="4" w:color="auto"/>
+        </w:pBdr>
+        <w:spacing w:after="0"/>
+      </w:pPr>
+      <w:r>
+        <w:t>30. ORGANIZATION-NUMBER_OF_EMPLOYEES_OR_MEMBERS relationship between entities occurs when an organization (Head entity) has a given number (Tail entity) of employees or members.</w:t>
+      </w:r>
+    </w:p>
+    <w:p>
+      <w:pPr>
+        <w:pBdr>
+          <w:top w:val="single" w:sz="4" w:space="1" w:color="auto"/>
+          <w:left w:val="single" w:sz="4" w:space="4" w:color="auto"/>
+          <w:bottom w:val="single" w:sz="4" w:space="1" w:color="auto"/>
+          <w:right w:val="single" w:sz="4" w:space="4" w:color="auto"/>
+        </w:pBdr>
+        <w:spacing w:after="0"/>
+      </w:pPr>
+      <w:r>
+        <w:t>31. PERSON-DATE_OF_BIRTH relationship between entities occurs when a person (Head entity) was born on a specific date or year (Tail entity).</w:t>
+      </w:r>
+    </w:p>
+    <w:p>
+      <w:pPr>
+        <w:pBdr>
+          <w:top w:val="single" w:sz="4" w:space="1" w:color="auto"/>
+          <w:left w:val="single" w:sz="4" w:space="4" w:color="auto"/>
+          <w:bottom w:val="single" w:sz="4" w:space="1" w:color="auto"/>
+          <w:right w:val="single" w:sz="4" w:space="4" w:color="auto"/>
+        </w:pBdr>
+        <w:spacing w:after="0"/>
+      </w:pPr>
+      <w:r>
+        <w:t>32. PERSON-CITY_OF_BIRTH relationship between entities occurs when a person (Head entity) was born in a specific city (Tail entity).</w:t>
+      </w:r>
+    </w:p>
+    <w:p>
+      <w:pPr>
+        <w:pBdr>
+          <w:top w:val="single" w:sz="4" w:space="1" w:color="auto"/>
+          <w:left w:val="single" w:sz="4" w:space="4" w:color="auto"/>
+          <w:bottom w:val="single" w:sz="4" w:space="1" w:color="auto"/>
+          <w:right w:val="single" w:sz="4" w:space="4" w:color="auto"/>
+        </w:pBdr>
+        <w:spacing w:after="0"/>
+      </w:pPr>
+      <w:r>
+        <w:t xml:space="preserve">33. PERSON-CHARGES relationship between entities occurs when a person (Head entity) has </w:t>
+      </w:r>
+      <w:r>
+        <w:t>committed</w:t>
+      </w:r>
+      <w:r>
+        <w:t xml:space="preserve"> a specific crime (Tail entity).</w:t>
+      </w:r>
+    </w:p>
+    <w:p>
+      <w:pPr>
+        <w:pBdr>
+          <w:top w:val="single" w:sz="4" w:space="1" w:color="auto"/>
+          <w:left w:val="single" w:sz="4" w:space="4" w:color="auto"/>
+          <w:bottom w:val="single" w:sz="4" w:space="1" w:color="auto"/>
+          <w:right w:val="single" w:sz="4" w:space="4" w:color="auto"/>
+        </w:pBdr>
+        <w:spacing w:after="0"/>
+      </w:pPr>
+      <w:r>
+        <w:t>34. PERSON-STATE_OR_PROVINCE_OF_DEATH relationship between entities occurs when a person (Head entity) has died in a specific state or province (Tail entity).</w:t>
+      </w:r>
+    </w:p>
+    <w:p>
+      <w:pPr>
+        <w:pBdr>
+          <w:top w:val="single" w:sz="4" w:space="1" w:color="auto"/>
+          <w:left w:val="single" w:sz="4" w:space="4" w:color="auto"/>
+          <w:bottom w:val="single" w:sz="4" w:space="1" w:color="auto"/>
+          <w:right w:val="single" w:sz="4" w:space="4" w:color="auto"/>
+        </w:pBdr>
+        <w:spacing w:after="0"/>
+      </w:pPr>
+      <w:r>
+        <w:t>35. PERSON-RELIGION relationship between entities occurs when a person (Head entity) follows a specific religion (Tail entity).</w:t>
+      </w:r>
+    </w:p>
+    <w:p>
+      <w:pPr>
+        <w:pBdr>
+          <w:top w:val="single" w:sz="4" w:space="1" w:color="auto"/>
+          <w:left w:val="single" w:sz="4" w:space="4" w:color="auto"/>
+          <w:bottom w:val="single" w:sz="4" w:space="1" w:color="auto"/>
+          <w:right w:val="single" w:sz="4" w:space="4" w:color="auto"/>
+        </w:pBdr>
+        <w:spacing w:after="0"/>
+      </w:pPr>
+      <w:r>
+        <w:t>36. PERSON-STATE_OR_PROVINCE_OF_BIRTH relationship between entities occurs when a person (Head entity) was born in a specific state or province (Tail entity).</w:t>
+      </w:r>
+    </w:p>
+    <w:p>
+      <w:pPr>
+        <w:pBdr>
+          <w:top w:val="single" w:sz="4" w:space="1" w:color="auto"/>
+          <w:left w:val="single" w:sz="4" w:space="4" w:color="auto"/>
+          <w:bottom w:val="single" w:sz="4" w:space="1" w:color="auto"/>
+          <w:right w:val="single" w:sz="4" w:space="4" w:color="auto"/>
+        </w:pBdr>
+        <w:spacing w:after="0"/>
+      </w:pPr>
+      <w:r>
+        <w:t>37. PERSON-COUNTRY_OF_BIRTH relationship between entities occurs when a person (Head entity) was born in a specific country (Tail entity).</w:t>
+      </w:r>
+    </w:p>
+    <w:p>
+      <w:pPr>
+        <w:pBdr>
+          <w:top w:val="single" w:sz="4" w:space="1" w:color="auto"/>
+          <w:left w:val="single" w:sz="4" w:space="4" w:color="auto"/>
+          <w:bottom w:val="single" w:sz="4" w:space="1" w:color="auto"/>
+          <w:right w:val="single" w:sz="4" w:space="4" w:color="auto"/>
+        </w:pBdr>
+        <w:spacing w:after="0"/>
+      </w:pPr>
+      <w:r>
+        <w:t>38. ORGANIZATION-DISSOLVED relationship between entities occurs when an organization (Head entity) was dissolved on a specific date or year (Tail entity).</w:t>
+      </w:r>
+    </w:p>
+    <w:p>
+      <w:pPr>
+        <w:pBdr>
+          <w:top w:val="single" w:sz="4" w:space="1" w:color="auto"/>
+          <w:left w:val="single" w:sz="4" w:space="4" w:color="auto"/>
+          <w:bottom w:val="single" w:sz="4" w:space="1" w:color="auto"/>
+          <w:right w:val="single" w:sz="4" w:space="4" w:color="auto"/>
+        </w:pBdr>
+        <w:spacing w:after="0"/>
+      </w:pPr>
+      <w:r>
+        <w:t>39. PERSON-COUNTRY_OF_DEATH relationship between entities occurs when a person (Head entity) has died in a specific country (Tail entity).</w:t>
+      </w:r>
+    </w:p>
+    <w:p>
+      <w:pPr>
+        <w:pBdr>
+          <w:top w:val="single" w:sz="4" w:space="1" w:color="auto"/>
+          <w:left w:val="single" w:sz="4" w:space="4" w:color="auto"/>
+          <w:bottom w:val="single" w:sz="4" w:space="1" w:color="auto"/>
+          <w:right w:val="single" w:sz="4" w:space="4" w:color="auto"/>
+        </w:pBdr>
+        <w:spacing w:after="0"/>
+      </w:pPr>
+      <w:r>
+        <w:t>40. NO_RELATION relationship between entities occurs when the relationship between the Head entity and the Tail entity cannot be categorised in one of the above relationships.</w:t>
+      </w:r>
+    </w:p>
+    <w:p>
+      <w:pPr>
+        <w:pBdr>
+          <w:top w:val="single" w:sz="4" w:space="1" w:color="auto"/>
+          <w:left w:val="single" w:sz="4" w:space="4" w:color="auto"/>
+          <w:bottom w:val="single" w:sz="4" w:space="1" w:color="auto"/>
+          <w:right w:val="single" w:sz="4" w:space="4" w:color="auto"/>
+        </w:pBdr>
+      </w:pPr>
+      <w:r>
+        <w:t>---</w:t>
+      </w:r>
+    </w:p>
+    <w:p>
+      <w:pPr>
+        <w:pBdr>
+          <w:top w:val="single" w:sz="4" w:space="1" w:color="auto"/>
+          <w:left w:val="single" w:sz="4" w:space="4" w:color="auto"/>
+          <w:bottom w:val="single" w:sz="4" w:space="1" w:color="auto"/>
+          <w:right w:val="single" w:sz="4" w:space="4" w:color="auto"/>
+        </w:pBdr>
+      </w:pPr>
+      <w:r>
         <w:lastRenderedPageBreak/>
-        <w:t>20. PERSON-PARENTS relationship between entities occurs when a person (Head entity) has another person (Tail entity) as parents.</w:t>
-      </w:r>
-    </w:p>
-    <w:p>
-      <w:pPr>
-        <w:pBdr>
-          <w:top w:val="single" w:sz="4" w:space="1" w:color="auto"/>
-          <w:left w:val="single" w:sz="4" w:space="4" w:color="auto"/>
-          <w:bottom w:val="single" w:sz="4" w:space="1" w:color="auto"/>
-          <w:right w:val="single" w:sz="4" w:space="4" w:color="auto"/>
-        </w:pBdr>
-        <w:spacing w:after="0"/>
-      </w:pPr>
-      <w:r>
-        <w:t>21. PERSON-DATE_OF_DEATH relationship between entities occurs when a person (Head entity) has died on specific day or date (Tail entity).</w:t>
-      </w:r>
-    </w:p>
-    <w:p>
-      <w:pPr>
-        <w:pBdr>
-          <w:top w:val="single" w:sz="4" w:space="1" w:color="auto"/>
-          <w:left w:val="single" w:sz="4" w:space="4" w:color="auto"/>
-          <w:bottom w:val="single" w:sz="4" w:space="1" w:color="auto"/>
-          <w:right w:val="single" w:sz="4" w:space="4" w:color="auto"/>
-        </w:pBdr>
-        <w:spacing w:after="0"/>
-      </w:pPr>
-      <w:r>
-        <w:t>22. ORGANIZATION-MEMBER_OF relationship between entities occurs when an organization (Head entity) is part of another country or organization (Tail entity).</w:t>
-      </w:r>
-    </w:p>
-    <w:p>
-      <w:pPr>
-        <w:pBdr>
-          <w:top w:val="single" w:sz="4" w:space="1" w:color="auto"/>
-          <w:left w:val="single" w:sz="4" w:space="4" w:color="auto"/>
-          <w:bottom w:val="single" w:sz="4" w:space="1" w:color="auto"/>
-          <w:right w:val="single" w:sz="4" w:space="4" w:color="auto"/>
-        </w:pBdr>
-        <w:spacing w:after="0"/>
-      </w:pPr>
-      <w:r>
-        <w:t>23. ORGANIZATION-FOUNDED_BY relationship between entities occurs when an organization (Head entity) is founded by a person (Tail entity).</w:t>
-      </w:r>
-    </w:p>
-    <w:p>
-      <w:pPr>
-        <w:pBdr>
-          <w:top w:val="single" w:sz="4" w:space="1" w:color="auto"/>
-          <w:left w:val="single" w:sz="4" w:space="4" w:color="auto"/>
-          <w:bottom w:val="single" w:sz="4" w:space="1" w:color="auto"/>
-          <w:right w:val="single" w:sz="4" w:space="4" w:color="auto"/>
-        </w:pBdr>
-        <w:spacing w:after="0"/>
-      </w:pPr>
-      <w:r>
-        <w:t>24. ORGANIZATION-WEBSITE relationship between entities occurs when an organization (Head entity) has a website or URL (Tail entity).</w:t>
-      </w:r>
-    </w:p>
-    <w:p>
-      <w:pPr>
-        <w:pBdr>
-          <w:top w:val="single" w:sz="4" w:space="1" w:color="auto"/>
-          <w:left w:val="single" w:sz="4" w:space="4" w:color="auto"/>
-          <w:bottom w:val="single" w:sz="4" w:space="1" w:color="auto"/>
-          <w:right w:val="single" w:sz="4" w:space="4" w:color="auto"/>
-        </w:pBdr>
-        <w:spacing w:after="0"/>
-      </w:pPr>
-      <w:r>
-        <w:t>25. PERSON-CAUSE_OF_DEATH relationship between entities occurs when a person (Head entity) has died because of a cause (Tail entity).</w:t>
-      </w:r>
-    </w:p>
-    <w:p>
-      <w:pPr>
-        <w:pBdr>
-          <w:top w:val="single" w:sz="4" w:space="1" w:color="auto"/>
-          <w:left w:val="single" w:sz="4" w:space="4" w:color="auto"/>
-          <w:bottom w:val="single" w:sz="4" w:space="1" w:color="auto"/>
-          <w:right w:val="single" w:sz="4" w:space="4" w:color="auto"/>
-        </w:pBdr>
-        <w:spacing w:after="0"/>
-      </w:pPr>
-      <w:r>
-        <w:t>26. ORGANIZATION-POLITICAL_OR_RELIGIOUS_AFFILIATION relationship between entities occurs when a person (Head entity) has political or religious affiliation to Political party or Religion (Tail entity).</w:t>
-      </w:r>
-    </w:p>
-    <w:p>
-      <w:pPr>
-        <w:pBdr>
-          <w:top w:val="single" w:sz="4" w:space="1" w:color="auto"/>
-          <w:left w:val="single" w:sz="4" w:space="4" w:color="auto"/>
-          <w:bottom w:val="single" w:sz="4" w:space="1" w:color="auto"/>
-          <w:right w:val="single" w:sz="4" w:space="4" w:color="auto"/>
-        </w:pBdr>
-        <w:spacing w:after="0"/>
-      </w:pPr>
-      <w:r>
-        <w:t>27. ORGANIZATION-FOUNDED relationship between entities occurs when an organization (Head entity) was founded on a specific date or year (Tail entity).</w:t>
-      </w:r>
-    </w:p>
-    <w:p>
-      <w:pPr>
-        <w:pBdr>
-          <w:top w:val="single" w:sz="4" w:space="1" w:color="auto"/>
-          <w:left w:val="single" w:sz="4" w:space="4" w:color="auto"/>
-          <w:bottom w:val="single" w:sz="4" w:space="1" w:color="auto"/>
-          <w:right w:val="single" w:sz="4" w:space="4" w:color="auto"/>
-        </w:pBdr>
-        <w:spacing w:after="0"/>
-      </w:pPr>
-      <w:r>
-        <w:t>28. PERSON-CITY_OF_DEATH relationship between entities occurs when a person (Head entity) has died in a specific city (Tail entity).</w:t>
-      </w:r>
-    </w:p>
-    <w:p>
-      <w:pPr>
-        <w:pBdr>
-          <w:top w:val="single" w:sz="4" w:space="1" w:color="auto"/>
-          <w:left w:val="single" w:sz="4" w:space="4" w:color="auto"/>
-          <w:bottom w:val="single" w:sz="4" w:space="1" w:color="auto"/>
-          <w:right w:val="single" w:sz="4" w:space="4" w:color="auto"/>
-        </w:pBdr>
-        <w:spacing w:after="0"/>
-      </w:pPr>
-      <w:r>
-        <w:t xml:space="preserve">29. ORGANIZATION-SHAREHOLDERS relationship between entities occurs when an organization (Head entity) has a person or organization (Tail entity) as </w:t>
-      </w:r>
-      <w:r>
-        <w:t>shareholders</w:t>
-      </w:r>
-      <w:r>
-        <w:t>.</w:t>
-      </w:r>
-    </w:p>
-    <w:p>
-      <w:pPr>
-        <w:pBdr>
-          <w:top w:val="single" w:sz="4" w:space="1" w:color="auto"/>
-          <w:left w:val="single" w:sz="4" w:space="4" w:color="auto"/>
-          <w:bottom w:val="single" w:sz="4" w:space="1" w:color="auto"/>
-          <w:right w:val="single" w:sz="4" w:space="4" w:color="auto"/>
-        </w:pBdr>
-        <w:spacing w:after="0"/>
-      </w:pPr>
-      <w:r>
-        <w:t>30. ORGANIZATION-NUMBER_OF_EMPLOYEES_OR_MEMBERS relationship between entities occurs when an organization (Head entity) has a given number (Tail entity) of employees or members.</w:t>
-      </w:r>
-    </w:p>
-    <w:p>
-      <w:pPr>
-        <w:pBdr>
-          <w:top w:val="single" w:sz="4" w:space="1" w:color="auto"/>
-          <w:left w:val="single" w:sz="4" w:space="4" w:color="auto"/>
-          <w:bottom w:val="single" w:sz="4" w:space="1" w:color="auto"/>
-          <w:right w:val="single" w:sz="4" w:space="4" w:color="auto"/>
-        </w:pBdr>
-        <w:spacing w:after="0"/>
-      </w:pPr>
-      <w:r>
-        <w:t>31. PERSON-DATE_OF_BIRTH relationship between entities occurs when a person (Head entity) was born on a specific date or year (Tail entity).</w:t>
-      </w:r>
-    </w:p>
-    <w:p>
-      <w:pPr>
-        <w:pBdr>
-          <w:top w:val="single" w:sz="4" w:space="1" w:color="auto"/>
-          <w:left w:val="single" w:sz="4" w:space="4" w:color="auto"/>
-          <w:bottom w:val="single" w:sz="4" w:space="1" w:color="auto"/>
-          <w:right w:val="single" w:sz="4" w:space="4" w:color="auto"/>
-        </w:pBdr>
-        <w:spacing w:after="0"/>
-      </w:pPr>
-      <w:r>
-        <w:t>32. PERSON-CITY_OF_BIRTH relationship between entities occurs when a person (Head entity) was born in a specific city (Tail entity).</w:t>
-      </w:r>
-    </w:p>
-    <w:p>
-      <w:pPr>
-        <w:pBdr>
-          <w:top w:val="single" w:sz="4" w:space="1" w:color="auto"/>
-          <w:left w:val="single" w:sz="4" w:space="4" w:color="auto"/>
-          <w:bottom w:val="single" w:sz="4" w:space="1" w:color="auto"/>
-          <w:right w:val="single" w:sz="4" w:space="4" w:color="auto"/>
-        </w:pBdr>
-        <w:spacing w:after="0"/>
-      </w:pPr>
-      <w:r>
-        <w:t xml:space="preserve">33. PERSON-CHARGES relationship between entities occurs when a person (Head entity) has </w:t>
-      </w:r>
-      <w:r>
-        <w:t>committed</w:t>
-      </w:r>
-      <w:r>
-        <w:t xml:space="preserve"> a specific crime (Tail entity).</w:t>
-      </w:r>
-    </w:p>
-    <w:p>
-      <w:pPr>
-        <w:pBdr>
-          <w:top w:val="single" w:sz="4" w:space="1" w:color="auto"/>
-          <w:left w:val="single" w:sz="4" w:space="4" w:color="auto"/>
-          <w:bottom w:val="single" w:sz="4" w:space="1" w:color="auto"/>
-          <w:right w:val="single" w:sz="4" w:space="4" w:color="auto"/>
-        </w:pBdr>
-        <w:spacing w:after="0"/>
-      </w:pPr>
-      <w:r>
-        <w:t>34. PERSON-STATE_OR_PROVINCE_OF_DEATH relationship between entities occurs when a person (Head entity) has died in a specific state or province (Tail entity).</w:t>
-      </w:r>
-    </w:p>
-    <w:p>
-      <w:pPr>
-        <w:pBdr>
-          <w:top w:val="single" w:sz="4" w:space="1" w:color="auto"/>
-          <w:left w:val="single" w:sz="4" w:space="4" w:color="auto"/>
-          <w:bottom w:val="single" w:sz="4" w:space="1" w:color="auto"/>
-          <w:right w:val="single" w:sz="4" w:space="4" w:color="auto"/>
-        </w:pBdr>
-        <w:spacing w:after="0"/>
-      </w:pPr>
-      <w:r>
-        <w:t>35. PERSON-RELIGION relationship between entities occurs when a person (Head entity) follows a specific religion (Tail entity).</w:t>
-      </w:r>
-    </w:p>
-    <w:p>
-      <w:pPr>
-        <w:pBdr>
-          <w:top w:val="single" w:sz="4" w:space="1" w:color="auto"/>
-          <w:left w:val="single" w:sz="4" w:space="4" w:color="auto"/>
-          <w:bottom w:val="single" w:sz="4" w:space="1" w:color="auto"/>
-          <w:right w:val="single" w:sz="4" w:space="4" w:color="auto"/>
-        </w:pBdr>
-        <w:spacing w:after="0"/>
-      </w:pPr>
-      <w:r>
-        <w:t>36. PERSON-STATE_OR_PROVINCE_OF_BIRTH relationship between entities occurs when a person (Head entity) was born in a specific state or province (Tail entity).</w:t>
-      </w:r>
-    </w:p>
-    <w:p>
-      <w:pPr>
-        <w:pBdr>
-          <w:top w:val="single" w:sz="4" w:space="1" w:color="auto"/>
-          <w:left w:val="single" w:sz="4" w:space="4" w:color="auto"/>
-          <w:bottom w:val="single" w:sz="4" w:space="1" w:color="auto"/>
-          <w:right w:val="single" w:sz="4" w:space="4" w:color="auto"/>
-        </w:pBdr>
-        <w:spacing w:after="0"/>
-      </w:pPr>
-      <w:r>
-        <w:t>37. PERSON-COUNTRY_OF_BIRTH relationship between entities occurs when a person (Head entity) was born in a specific country (Tail entity).</w:t>
-      </w:r>
-    </w:p>
-    <w:p>
-      <w:pPr>
-        <w:pBdr>
-          <w:top w:val="single" w:sz="4" w:space="1" w:color="auto"/>
-          <w:left w:val="single" w:sz="4" w:space="4" w:color="auto"/>
-          <w:bottom w:val="single" w:sz="4" w:space="1" w:color="auto"/>
-          <w:right w:val="single" w:sz="4" w:space="4" w:color="auto"/>
-        </w:pBdr>
-        <w:spacing w:after="0"/>
-      </w:pPr>
-      <w:r>
-        <w:t>38. ORGANIZATION-DISSOLVED relationship between entities occurs when an organization (Head entity) was dissolved on a specific date or year (Tail entity).</w:t>
-      </w:r>
-    </w:p>
-    <w:p>
-      <w:pPr>
-        <w:pBdr>
-          <w:top w:val="single" w:sz="4" w:space="1" w:color="auto"/>
-          <w:left w:val="single" w:sz="4" w:space="4" w:color="auto"/>
-          <w:bottom w:val="single" w:sz="4" w:space="1" w:color="auto"/>
-          <w:right w:val="single" w:sz="4" w:space="4" w:color="auto"/>
-        </w:pBdr>
-        <w:spacing w:after="0"/>
-      </w:pPr>
-      <w:r>
-        <w:t>39. PERSON-COUNTRY_OF_DEATH relationship between entities occurs when a person (Head entity) has died in a specific country (Tail entity).</w:t>
-      </w:r>
-    </w:p>
-    <w:p>
-      <w:pPr>
-        <w:pBdr>
-          <w:top w:val="single" w:sz="4" w:space="1" w:color="auto"/>
-          <w:left w:val="single" w:sz="4" w:space="4" w:color="auto"/>
-          <w:bottom w:val="single" w:sz="4" w:space="1" w:color="auto"/>
-          <w:right w:val="single" w:sz="4" w:space="4" w:color="auto"/>
-        </w:pBdr>
-        <w:spacing w:after="0"/>
-      </w:pPr>
-      <w:r>
-        <w:t>40. NO_RELATION relationship between entities occurs when the relationship between the Head entity and the Tail entity cannot be categorised in one of the above relationships.</w:t>
-      </w:r>
-    </w:p>
-    <w:p>
-      <w:pPr>
-        <w:pBdr>
-          <w:top w:val="single" w:sz="4" w:space="1" w:color="auto"/>
-          <w:left w:val="single" w:sz="4" w:space="4" w:color="auto"/>
-          <w:bottom w:val="single" w:sz="4" w:space="1" w:color="auto"/>
-          <w:right w:val="single" w:sz="4" w:space="4" w:color="auto"/>
-        </w:pBdr>
-      </w:pPr>
-      <w:r>
-        <w:t>---</w:t>
-      </w:r>
-    </w:p>
-    <w:p>
-      <w:pPr>
-        <w:pBdr>
-          <w:top w:val="single" w:sz="4" w:space="1" w:color="auto"/>
-          <w:left w:val="single" w:sz="4" w:space="4" w:color="auto"/>
-          <w:bottom w:val="single" w:sz="4" w:space="1" w:color="auto"/>
-          <w:right w:val="single" w:sz="4" w:space="4" w:color="auto"/>
-        </w:pBdr>
-      </w:pPr>
-      <w:r>
-        <w:t xml:space="preserve">You will generate response in the form: In the given sentence, the relationship between &lt;head-entity&gt; and &lt;tail-entity&gt; entities is: &lt;best from the list of relationships&gt;. </w:t>
-      </w:r>
-    </w:p>
-    <w:p>
-      <w:pPr>
-        <w:pBdr>
-          <w:top w:val="single" w:sz="4" w:space="1" w:color="auto"/>
-          <w:left w:val="single" w:sz="4" w:space="4" w:color="auto"/>
-          <w:bottom w:val="single" w:sz="4" w:space="1" w:color="auto"/>
-          <w:right w:val="single" w:sz="4" w:space="4" w:color="auto"/>
-        </w:pBdr>
-      </w:pPr>
-      <w:r>
-        <w:lastRenderedPageBreak/>
+        <w:t xml:space="preserve">You will generate response in the form: In the given sentence, the relationship between &lt;head-entity&gt; and &lt;tail-entity&gt; entities </w:t>
+      </w:r>
+      <w:proofErr w:type="gramStart"/>
+      <w:r>
+        <w:t>is</w:t>
+      </w:r>
+      <w:proofErr w:type="gramEnd"/>
+      <w:r>
+        <w:t xml:space="preserve">: &lt;best from the list of relationships&gt;. </w:t>
+      </w:r>
+    </w:p>
+    <w:p>
+      <w:pPr>
+        <w:pBdr>
+          <w:top w:val="single" w:sz="4" w:space="1" w:color="auto"/>
+          <w:left w:val="single" w:sz="4" w:space="4" w:color="auto"/>
+          <w:bottom w:val="single" w:sz="4" w:space="1" w:color="auto"/>
+          <w:right w:val="single" w:sz="4" w:space="4" w:color="auto"/>
+        </w:pBdr>
+      </w:pPr>
+      <w:r>
         <w:t>----</w:t>
       </w:r>
     </w:p>
@@ -4413,7 +4847,15 @@
         </w:pBdr>
       </w:pPr>
       <w:r>
-        <w:t>In the given sentence, the relationship between [HEAD ENTITY] and [TAIL ENTITY] entities is:'''</w:t>
+        <w:t xml:space="preserve">In the given sentence, the relationship between [HEAD ENTITY] and [TAIL ENTITY] entities </w:t>
+      </w:r>
+      <w:proofErr w:type="gramStart"/>
+      <w:r>
+        <w:t>is</w:t>
+      </w:r>
+      <w:proofErr w:type="gramEnd"/>
+      <w:r>
+        <w:t>:'''</w:t>
       </w:r>
     </w:p>
     <w:p>
@@ -4494,7 +4936,15 @@
         </w:pBdr>
       </w:pPr>
       <w:r>
-        <w:t xml:space="preserve">You will generate response in the form: In the given sentence, the relationship between &lt;head-entity&gt; and &lt;tail-entity&gt; entities is: &lt;best from the list of relationships&gt;. </w:t>
+        <w:t xml:space="preserve">You will generate response in the form: In the given sentence, the relationship between &lt;head-entity&gt; and &lt;tail-entity&gt; entities </w:t>
+      </w:r>
+      <w:proofErr w:type="gramStart"/>
+      <w:r>
+        <w:t>is</w:t>
+      </w:r>
+      <w:proofErr w:type="gramEnd"/>
+      <w:r>
+        <w:t xml:space="preserve">: &lt;best from the list of relationships&gt;. </w:t>
       </w:r>
     </w:p>
     <w:p>
@@ -4570,7 +5020,15 @@
         <w:t xml:space="preserve">In the above sentence, the relationship between </w:t>
       </w:r>
       <w:r>
-        <w:t>[HEAD ENTITY] and [TAIL ENTITY] entities is: [RELATIONSHIP]</w:t>
+        <w:t xml:space="preserve">[HEAD ENTITY] and [TAIL ENTITY] entities </w:t>
+      </w:r>
+      <w:proofErr w:type="gramStart"/>
+      <w:r>
+        <w:t>is</w:t>
+      </w:r>
+      <w:proofErr w:type="gramEnd"/>
+      <w:r>
+        <w:t>: [RELATIONSHIP]</w:t>
       </w:r>
     </w:p>
     <w:p>
@@ -4617,7 +5075,15 @@
         </w:pBdr>
       </w:pPr>
       <w:r>
-        <w:t>In the above sentence, the relationship between [HEAD ENTITY] and [TAIL ENTITY] entities is: [RELATIONSHIP]</w:t>
+        <w:t xml:space="preserve">In the above sentence, the relationship between [HEAD ENTITY] and [TAIL ENTITY] entities </w:t>
+      </w:r>
+      <w:proofErr w:type="gramStart"/>
+      <w:r>
+        <w:t>is</w:t>
+      </w:r>
+      <w:proofErr w:type="gramEnd"/>
+      <w:r>
+        <w:t>: [RELATIONSHIP]</w:t>
       </w:r>
     </w:p>
     <w:p>
@@ -4664,21 +5130,29 @@
         </w:pBdr>
       </w:pPr>
       <w:r>
-        <w:t>In the above sentence, the relationship between [HEAD ENTITY] and [TAIL ENTITY] entities is: [RELATIONSHIP]</w:t>
-      </w:r>
-    </w:p>
-    <w:p>
-      <w:pPr>
-        <w:pBdr>
-          <w:top w:val="single" w:sz="4" w:space="1" w:color="auto"/>
-          <w:left w:val="single" w:sz="4" w:space="4" w:color="auto"/>
-          <w:bottom w:val="single" w:sz="4" w:space="1" w:color="auto"/>
-          <w:right w:val="single" w:sz="4" w:space="4" w:color="auto"/>
-        </w:pBdr>
-        <w:spacing w:after="0"/>
-      </w:pPr>
-      <w:r>
         <w:lastRenderedPageBreak/>
+        <w:t xml:space="preserve">In the above sentence, the relationship between [HEAD ENTITY] and [TAIL ENTITY] entities </w:t>
+      </w:r>
+      <w:proofErr w:type="gramStart"/>
+      <w:r>
+        <w:t>is</w:t>
+      </w:r>
+      <w:proofErr w:type="gramEnd"/>
+      <w:r>
+        <w:t>: [RELATIONSHIP]</w:t>
+      </w:r>
+    </w:p>
+    <w:p>
+      <w:pPr>
+        <w:pBdr>
+          <w:top w:val="single" w:sz="4" w:space="1" w:color="auto"/>
+          <w:left w:val="single" w:sz="4" w:space="4" w:color="auto"/>
+          <w:bottom w:val="single" w:sz="4" w:space="1" w:color="auto"/>
+          <w:right w:val="single" w:sz="4" w:space="4" w:color="auto"/>
+        </w:pBdr>
+        <w:spacing w:after="0"/>
+      </w:pPr>
+      <w:r>
         <w:t>Example-4:</w:t>
       </w:r>
     </w:p>
@@ -4712,7 +5186,15 @@
         </w:pBdr>
       </w:pPr>
       <w:r>
-        <w:t>In the above sentence, the relationship between [HEAD ENTITY] and [TAIL ENTITY] entities is: [RELATIONSHIP]</w:t>
+        <w:t xml:space="preserve">In the above sentence, the relationship between [HEAD ENTITY] and [TAIL ENTITY] entities </w:t>
+      </w:r>
+      <w:proofErr w:type="gramStart"/>
+      <w:r>
+        <w:t>is</w:t>
+      </w:r>
+      <w:proofErr w:type="gramEnd"/>
+      <w:r>
+        <w:t>: [RELATIONSHIP]</w:t>
       </w:r>
     </w:p>
     <w:p>
@@ -4759,7 +5241,15 @@
         </w:pBdr>
       </w:pPr>
       <w:r>
-        <w:t>In the above sentence, the relationship between [HEAD ENTITY] and [TAIL ENTITY] entities is: [RELATIONSHIP]</w:t>
+        <w:t xml:space="preserve">In the above sentence, the relationship between [HEAD ENTITY] and [TAIL ENTITY] entities </w:t>
+      </w:r>
+      <w:proofErr w:type="gramStart"/>
+      <w:r>
+        <w:t>is</w:t>
+      </w:r>
+      <w:proofErr w:type="gramEnd"/>
+      <w:r>
+        <w:t>: [RELATIONSHIP]</w:t>
       </w:r>
     </w:p>
     <w:p>
@@ -4817,7 +5307,15 @@
         </w:pBdr>
       </w:pPr>
       <w:r>
-        <w:t>In the given sentence, the relationship between [HEAD ENTITY] and [TAIL ENTITY] entities is:'''</w:t>
+        <w:t xml:space="preserve">In the given sentence, the relationship between [HEAD ENTITY] and [TAIL ENTITY] entities </w:t>
+      </w:r>
+      <w:proofErr w:type="gramStart"/>
+      <w:r>
+        <w:t>is</w:t>
+      </w:r>
+      <w:proofErr w:type="gramEnd"/>
+      <w:r>
+        <w:t>:'''</w:t>
       </w:r>
     </w:p>
     <w:p>
@@ -4915,7 +5413,15 @@
         </w:pBdr>
       </w:pPr>
       <w:r>
-        <w:t xml:space="preserve">You will generate response in the form: In the given sentence, the relationship between &lt;head-entity&gt; and &lt;tail-entity&gt; entities is: &lt;best from the list of relationships&gt;. </w:t>
+        <w:t xml:space="preserve">You will generate response in the form: In the given sentence, the relationship between &lt;head-entity&gt; and &lt;tail-entity&gt; entities </w:t>
+      </w:r>
+      <w:proofErr w:type="gramStart"/>
+      <w:r>
+        <w:t>is</w:t>
+      </w:r>
+      <w:proofErr w:type="gramEnd"/>
+      <w:r>
+        <w:t xml:space="preserve">: &lt;best from the list of relationships&gt;. </w:t>
       </w:r>
     </w:p>
     <w:p>
@@ -4955,6 +5461,7 @@
         <w:spacing w:after="0"/>
       </w:pPr>
       <w:r>
+        <w:lastRenderedPageBreak/>
         <w:t>Example-1:</w:t>
       </w:r>
     </w:p>
@@ -4989,55 +5496,438 @@
         <w:spacing w:after="0"/>
       </w:pPr>
       <w:r>
+        <w:t xml:space="preserve">In the above sentence, the relationship between [HEAD ENTITY] and [TAIL ENTITY] entities </w:t>
+      </w:r>
+      <w:proofErr w:type="gramStart"/>
+      <w:r>
+        <w:t>is</w:t>
+      </w:r>
+      <w:proofErr w:type="gramEnd"/>
+      <w:r>
+        <w:t>: [RELATIONSHIP]</w:t>
+      </w:r>
+    </w:p>
+    <w:p>
+      <w:pPr>
+        <w:pBdr>
+          <w:top w:val="single" w:sz="4" w:space="1" w:color="auto"/>
+          <w:left w:val="single" w:sz="4" w:space="4" w:color="auto"/>
+          <w:bottom w:val="single" w:sz="4" w:space="1" w:color="auto"/>
+          <w:right w:val="single" w:sz="4" w:space="4" w:color="auto"/>
+        </w:pBdr>
+      </w:pPr>
+      <w:r>
+        <w:t xml:space="preserve">COT </w:t>
+      </w:r>
+      <w:r>
+        <w:t>Explanation</w:t>
+      </w:r>
+      <w:r>
+        <w:t xml:space="preserve">: </w:t>
+      </w:r>
+      <w:r>
+        <w:t>[COT REASONING]</w:t>
+      </w:r>
+    </w:p>
+    <w:p>
+      <w:pPr>
+        <w:pBdr>
+          <w:top w:val="single" w:sz="4" w:space="1" w:color="auto"/>
+          <w:left w:val="single" w:sz="4" w:space="4" w:color="auto"/>
+          <w:bottom w:val="single" w:sz="4" w:space="1" w:color="auto"/>
+          <w:right w:val="single" w:sz="4" w:space="4" w:color="auto"/>
+        </w:pBdr>
+        <w:spacing w:after="0"/>
+      </w:pPr>
+      <w:r>
+        <w:t>Example-2:</w:t>
+      </w:r>
+    </w:p>
+    <w:p>
+      <w:pPr>
+        <w:pBdr>
+          <w:top w:val="single" w:sz="4" w:space="1" w:color="auto"/>
+          <w:left w:val="single" w:sz="4" w:space="4" w:color="auto"/>
+          <w:bottom w:val="single" w:sz="4" w:space="1" w:color="auto"/>
+          <w:right w:val="single" w:sz="4" w:space="4" w:color="auto"/>
+        </w:pBdr>
+        <w:spacing w:after="0"/>
+      </w:pPr>
+      <w:r>
+        <w:t xml:space="preserve">Sentence: </w:t>
+      </w:r>
+      <w:r>
+        <w:rPr>
+          <w:rFonts w:cs="Calibri"/>
+        </w:rPr>
+        <w:t>[TEXT]</w:t>
+      </w:r>
+    </w:p>
+    <w:p>
+      <w:pPr>
+        <w:pBdr>
+          <w:top w:val="single" w:sz="4" w:space="1" w:color="auto"/>
+          <w:left w:val="single" w:sz="4" w:space="4" w:color="auto"/>
+          <w:bottom w:val="single" w:sz="4" w:space="1" w:color="auto"/>
+          <w:right w:val="single" w:sz="4" w:space="4" w:color="auto"/>
+        </w:pBdr>
+        <w:spacing w:after="0"/>
+      </w:pPr>
+      <w:r>
+        <w:t xml:space="preserve">In the above sentence, the relationship between [HEAD ENTITY] and [TAIL ENTITY] entities </w:t>
+      </w:r>
+      <w:proofErr w:type="gramStart"/>
+      <w:r>
+        <w:t>is</w:t>
+      </w:r>
+      <w:proofErr w:type="gramEnd"/>
+      <w:r>
+        <w:t>: [RELATIONSHIP]</w:t>
+      </w:r>
+    </w:p>
+    <w:p>
+      <w:pPr>
+        <w:pBdr>
+          <w:top w:val="single" w:sz="4" w:space="1" w:color="auto"/>
+          <w:left w:val="single" w:sz="4" w:space="4" w:color="auto"/>
+          <w:bottom w:val="single" w:sz="4" w:space="1" w:color="auto"/>
+          <w:right w:val="single" w:sz="4" w:space="4" w:color="auto"/>
+        </w:pBdr>
+      </w:pPr>
+      <w:r>
+        <w:t>COT Explanation: [COT REASONING]</w:t>
+      </w:r>
+    </w:p>
+    <w:p>
+      <w:pPr>
+        <w:pBdr>
+          <w:top w:val="single" w:sz="4" w:space="1" w:color="auto"/>
+          <w:left w:val="single" w:sz="4" w:space="4" w:color="auto"/>
+          <w:bottom w:val="single" w:sz="4" w:space="1" w:color="auto"/>
+          <w:right w:val="single" w:sz="4" w:space="4" w:color="auto"/>
+        </w:pBdr>
+        <w:spacing w:after="0"/>
+      </w:pPr>
+      <w:r>
+        <w:t>Example-3:</w:t>
+      </w:r>
+    </w:p>
+    <w:p>
+      <w:pPr>
+        <w:pBdr>
+          <w:top w:val="single" w:sz="4" w:space="1" w:color="auto"/>
+          <w:left w:val="single" w:sz="4" w:space="4" w:color="auto"/>
+          <w:bottom w:val="single" w:sz="4" w:space="1" w:color="auto"/>
+          <w:right w:val="single" w:sz="4" w:space="4" w:color="auto"/>
+        </w:pBdr>
+        <w:spacing w:after="0"/>
+      </w:pPr>
+      <w:r>
+        <w:t xml:space="preserve">Sentence: </w:t>
+      </w:r>
+      <w:r>
+        <w:rPr>
+          <w:rFonts w:cs="Calibri"/>
+        </w:rPr>
+        <w:t>[TEXT]</w:t>
+      </w:r>
+    </w:p>
+    <w:p>
+      <w:pPr>
+        <w:pBdr>
+          <w:top w:val="single" w:sz="4" w:space="1" w:color="auto"/>
+          <w:left w:val="single" w:sz="4" w:space="4" w:color="auto"/>
+          <w:bottom w:val="single" w:sz="4" w:space="1" w:color="auto"/>
+          <w:right w:val="single" w:sz="4" w:space="4" w:color="auto"/>
+        </w:pBdr>
+        <w:spacing w:after="0"/>
+      </w:pPr>
+      <w:r>
+        <w:t xml:space="preserve">In the above sentence, the relationship between [HEAD ENTITY] and [TAIL ENTITY] entities </w:t>
+      </w:r>
+      <w:proofErr w:type="gramStart"/>
+      <w:r>
+        <w:t>is</w:t>
+      </w:r>
+      <w:proofErr w:type="gramEnd"/>
+      <w:r>
+        <w:t>: [RELATIONSHIP]</w:t>
+      </w:r>
+    </w:p>
+    <w:p>
+      <w:pPr>
+        <w:pBdr>
+          <w:top w:val="single" w:sz="4" w:space="1" w:color="auto"/>
+          <w:left w:val="single" w:sz="4" w:space="4" w:color="auto"/>
+          <w:bottom w:val="single" w:sz="4" w:space="1" w:color="auto"/>
+          <w:right w:val="single" w:sz="4" w:space="4" w:color="auto"/>
+        </w:pBdr>
+      </w:pPr>
+      <w:r>
+        <w:t>COT Explanation: [COT REASONING]</w:t>
+      </w:r>
+    </w:p>
+    <w:p>
+      <w:pPr>
+        <w:pBdr>
+          <w:top w:val="single" w:sz="4" w:space="1" w:color="auto"/>
+          <w:left w:val="single" w:sz="4" w:space="4" w:color="auto"/>
+          <w:bottom w:val="single" w:sz="4" w:space="1" w:color="auto"/>
+          <w:right w:val="single" w:sz="4" w:space="4" w:color="auto"/>
+        </w:pBdr>
+        <w:spacing w:after="0"/>
+      </w:pPr>
+      <w:r>
+        <w:t>Example-4:</w:t>
+      </w:r>
+    </w:p>
+    <w:p>
+      <w:pPr>
+        <w:pBdr>
+          <w:top w:val="single" w:sz="4" w:space="1" w:color="auto"/>
+          <w:left w:val="single" w:sz="4" w:space="4" w:color="auto"/>
+          <w:bottom w:val="single" w:sz="4" w:space="1" w:color="auto"/>
+          <w:right w:val="single" w:sz="4" w:space="4" w:color="auto"/>
+        </w:pBdr>
+        <w:spacing w:after="0"/>
+      </w:pPr>
+      <w:r>
+        <w:t xml:space="preserve">Sentence: </w:t>
+      </w:r>
+      <w:r>
+        <w:rPr>
+          <w:rFonts w:cs="Calibri"/>
+        </w:rPr>
+        <w:t>[TEXT]</w:t>
+      </w:r>
+    </w:p>
+    <w:p>
+      <w:pPr>
+        <w:pBdr>
+          <w:top w:val="single" w:sz="4" w:space="1" w:color="auto"/>
+          <w:left w:val="single" w:sz="4" w:space="4" w:color="auto"/>
+          <w:bottom w:val="single" w:sz="4" w:space="1" w:color="auto"/>
+          <w:right w:val="single" w:sz="4" w:space="4" w:color="auto"/>
+        </w:pBdr>
+        <w:spacing w:after="0"/>
+      </w:pPr>
+      <w:r>
+        <w:t xml:space="preserve">In the above sentence, the relationship between [HEAD ENTITY] and [TAIL ENTITY] entities </w:t>
+      </w:r>
+      <w:proofErr w:type="gramStart"/>
+      <w:r>
+        <w:t>is</w:t>
+      </w:r>
+      <w:proofErr w:type="gramEnd"/>
+      <w:r>
+        <w:t>: [RELATIONSHIP]</w:t>
+      </w:r>
+    </w:p>
+    <w:p>
+      <w:pPr>
+        <w:pBdr>
+          <w:top w:val="single" w:sz="4" w:space="1" w:color="auto"/>
+          <w:left w:val="single" w:sz="4" w:space="4" w:color="auto"/>
+          <w:bottom w:val="single" w:sz="4" w:space="1" w:color="auto"/>
+          <w:right w:val="single" w:sz="4" w:space="4" w:color="auto"/>
+        </w:pBdr>
+      </w:pPr>
+      <w:r>
+        <w:t>COT Explanation: [COT REASONING]</w:t>
+      </w:r>
+    </w:p>
+    <w:p>
+      <w:pPr>
+        <w:pBdr>
+          <w:top w:val="single" w:sz="4" w:space="1" w:color="auto"/>
+          <w:left w:val="single" w:sz="4" w:space="4" w:color="auto"/>
+          <w:bottom w:val="single" w:sz="4" w:space="1" w:color="auto"/>
+          <w:right w:val="single" w:sz="4" w:space="4" w:color="auto"/>
+        </w:pBdr>
+        <w:spacing w:after="0"/>
+      </w:pPr>
+      <w:r>
+        <w:t>Example-5:</w:t>
+      </w:r>
+    </w:p>
+    <w:p>
+      <w:pPr>
+        <w:pBdr>
+          <w:top w:val="single" w:sz="4" w:space="1" w:color="auto"/>
+          <w:left w:val="single" w:sz="4" w:space="4" w:color="auto"/>
+          <w:bottom w:val="single" w:sz="4" w:space="1" w:color="auto"/>
+          <w:right w:val="single" w:sz="4" w:space="4" w:color="auto"/>
+        </w:pBdr>
+        <w:spacing w:after="0"/>
+      </w:pPr>
+      <w:r>
+        <w:t xml:space="preserve">Sentence: </w:t>
+      </w:r>
+      <w:r>
+        <w:rPr>
+          <w:rFonts w:cs="Calibri"/>
+        </w:rPr>
+        <w:t>[TEXT]</w:t>
+      </w:r>
+    </w:p>
+    <w:p>
+      <w:pPr>
+        <w:pBdr>
+          <w:top w:val="single" w:sz="4" w:space="1" w:color="auto"/>
+          <w:left w:val="single" w:sz="4" w:space="4" w:color="auto"/>
+          <w:bottom w:val="single" w:sz="4" w:space="1" w:color="auto"/>
+          <w:right w:val="single" w:sz="4" w:space="4" w:color="auto"/>
+        </w:pBdr>
+        <w:spacing w:after="0"/>
+      </w:pPr>
+      <w:r>
+        <w:t xml:space="preserve">In the above sentence, the relationship between [HEAD ENTITY] and [TAIL ENTITY] entities </w:t>
+      </w:r>
+      <w:proofErr w:type="gramStart"/>
+      <w:r>
+        <w:t>is</w:t>
+      </w:r>
+      <w:proofErr w:type="gramEnd"/>
+      <w:r>
+        <w:t>: [RELATIONSHIP]</w:t>
+      </w:r>
+    </w:p>
+    <w:p>
+      <w:pPr>
+        <w:pBdr>
+          <w:top w:val="single" w:sz="4" w:space="1" w:color="auto"/>
+          <w:left w:val="single" w:sz="4" w:space="4" w:color="auto"/>
+          <w:bottom w:val="single" w:sz="4" w:space="1" w:color="auto"/>
+          <w:right w:val="single" w:sz="4" w:space="4" w:color="auto"/>
+        </w:pBdr>
+      </w:pPr>
+      <w:r>
+        <w:t>COT Explanation: [COT REASONING]</w:t>
+      </w:r>
+    </w:p>
+    <w:p>
+      <w:pPr>
+        <w:pBdr>
+          <w:top w:val="single" w:sz="4" w:space="1" w:color="auto"/>
+          <w:left w:val="single" w:sz="4" w:space="4" w:color="auto"/>
+          <w:bottom w:val="single" w:sz="4" w:space="1" w:color="auto"/>
+          <w:right w:val="single" w:sz="4" w:space="4" w:color="auto"/>
+        </w:pBdr>
+      </w:pPr>
+      <w:r>
+        <w:t>----</w:t>
+      </w:r>
+    </w:p>
+    <w:p>
+      <w:pPr>
+        <w:pBdr>
+          <w:top w:val="single" w:sz="4" w:space="1" w:color="auto"/>
+          <w:left w:val="single" w:sz="4" w:space="4" w:color="auto"/>
+          <w:bottom w:val="single" w:sz="4" w:space="1" w:color="auto"/>
+          <w:right w:val="single" w:sz="4" w:space="4" w:color="auto"/>
+        </w:pBdr>
+        <w:rPr>
+          <w:rFonts w:cs="Calibri"/>
+        </w:rPr>
+      </w:pPr>
+      <w:r>
+        <w:rPr>
+          <w:rFonts w:cs="Calibri"/>
+        </w:rPr>
+        <w:t>Sentence: [TEXT]</w:t>
+      </w:r>
+    </w:p>
+    <w:p>
+      <w:pPr>
+        <w:pBdr>
+          <w:top w:val="single" w:sz="4" w:space="1" w:color="auto"/>
+          <w:left w:val="single" w:sz="4" w:space="4" w:color="auto"/>
+          <w:bottom w:val="single" w:sz="4" w:space="1" w:color="auto"/>
+          <w:right w:val="single" w:sz="4" w:space="4" w:color="auto"/>
+        </w:pBdr>
+      </w:pPr>
+      <w:r>
+        <w:t xml:space="preserve">In the given sentence, the relationship between [HEAD ENTITY] and [TAIL ENTITY] entities </w:t>
+      </w:r>
+      <w:proofErr w:type="gramStart"/>
+      <w:r>
+        <w:t>is</w:t>
+      </w:r>
+      <w:proofErr w:type="gramEnd"/>
+      <w:r>
+        <w:t>:'''</w:t>
+      </w:r>
+    </w:p>
+    <w:p>
+      <w:r>
+        <w:br w:type="page"/>
+      </w:r>
+    </w:p>
+    <w:p>
+      <w:pPr>
+        <w:spacing w:after="360"/>
+        <w:jc w:val="center"/>
+        <w:rPr>
+          <w:b/>
+          <w:bCs/>
+          <w:sz w:val="28"/>
+          <w:szCs w:val="28"/>
+          <w:u w:val="single"/>
+        </w:rPr>
+      </w:pPr>
+      <w:r>
+        <w:rPr>
+          <w:b/>
+          <w:bCs/>
+          <w:sz w:val="28"/>
+          <w:szCs w:val="28"/>
+          <w:u w:val="single"/>
+        </w:rPr>
         <w:lastRenderedPageBreak/>
-        <w:t>In the above sentence, the relationship between [HEAD ENTITY] and [TAIL ENTITY] entities is: [RELATIONSHIP]</w:t>
-      </w:r>
-    </w:p>
-    <w:p>
-      <w:pPr>
-        <w:pBdr>
-          <w:top w:val="single" w:sz="4" w:space="1" w:color="auto"/>
-          <w:left w:val="single" w:sz="4" w:space="4" w:color="auto"/>
-          <w:bottom w:val="single" w:sz="4" w:space="1" w:color="auto"/>
-          <w:right w:val="single" w:sz="4" w:space="4" w:color="auto"/>
-        </w:pBdr>
-      </w:pPr>
-      <w:r>
-        <w:t xml:space="preserve">COT </w:t>
-      </w:r>
-      <w:r>
-        <w:t>Explanation</w:t>
-      </w:r>
-      <w:r>
-        <w:t xml:space="preserve">: </w:t>
-      </w:r>
-      <w:r>
-        <w:t>[COT REASONING]</w:t>
-      </w:r>
-    </w:p>
-    <w:p>
-      <w:pPr>
-        <w:pBdr>
-          <w:top w:val="single" w:sz="4" w:space="1" w:color="auto"/>
-          <w:left w:val="single" w:sz="4" w:space="4" w:color="auto"/>
-          <w:bottom w:val="single" w:sz="4" w:space="1" w:color="auto"/>
-          <w:right w:val="single" w:sz="4" w:space="4" w:color="auto"/>
-        </w:pBdr>
-        <w:spacing w:after="0"/>
-      </w:pPr>
-      <w:r>
-        <w:t>Example-2:</w:t>
-      </w:r>
-    </w:p>
-    <w:p>
-      <w:pPr>
-        <w:pBdr>
-          <w:top w:val="single" w:sz="4" w:space="1" w:color="auto"/>
-          <w:left w:val="single" w:sz="4" w:space="4" w:color="auto"/>
-          <w:bottom w:val="single" w:sz="4" w:space="1" w:color="auto"/>
-          <w:right w:val="single" w:sz="4" w:space="4" w:color="auto"/>
-        </w:pBdr>
-        <w:spacing w:after="0"/>
+        <w:t xml:space="preserve">LLM-RE Framework: </w:t>
+      </w:r>
+      <w:r>
+        <w:rPr>
+          <w:b/>
+          <w:bCs/>
+          <w:sz w:val="28"/>
+          <w:szCs w:val="28"/>
+          <w:u w:val="single"/>
+        </w:rPr>
+        <w:t>CoT Generation</w:t>
+      </w:r>
+      <w:r>
+        <w:rPr>
+          <w:b/>
+          <w:bCs/>
+          <w:sz w:val="28"/>
+          <w:szCs w:val="28"/>
+          <w:u w:val="single"/>
+        </w:rPr>
+        <w:t xml:space="preserve"> Prompt</w:t>
+      </w:r>
+    </w:p>
+    <w:p>
+      <w:pPr>
+        <w:pBdr>
+          <w:top w:val="single" w:sz="4" w:space="1" w:color="auto"/>
+          <w:left w:val="single" w:sz="4" w:space="4" w:color="auto"/>
+          <w:bottom w:val="single" w:sz="4" w:space="1" w:color="auto"/>
+          <w:right w:val="single" w:sz="4" w:space="4" w:color="auto"/>
+        </w:pBdr>
+      </w:pPr>
+      <w:r>
+        <w:t>You are Linguistic expert, which can generate chain of thoughts to identify relationship between entities in given the sentence.</w:t>
+      </w:r>
+    </w:p>
+    <w:p>
+      <w:pPr>
+        <w:pBdr>
+          <w:top w:val="single" w:sz="4" w:space="1" w:color="auto"/>
+          <w:left w:val="single" w:sz="4" w:space="4" w:color="auto"/>
+          <w:bottom w:val="single" w:sz="4" w:space="1" w:color="auto"/>
+          <w:right w:val="single" w:sz="4" w:space="4" w:color="auto"/>
+        </w:pBdr>
       </w:pPr>
       <w:r>
         <w:t xml:space="preserve">Sentence: </w:t>
@@ -5057,254 +5947,23 @@
           <w:bottom w:val="single" w:sz="4" w:space="1" w:color="auto"/>
           <w:right w:val="single" w:sz="4" w:space="4" w:color="auto"/>
         </w:pBdr>
-        <w:spacing w:after="0"/>
-      </w:pPr>
-      <w:r>
-        <w:t>In the above sentence, the relationship between [HEAD ENTITY] and [TAIL ENTITY] entities is: [RELATIONSHIP]</w:t>
-      </w:r>
-    </w:p>
-    <w:p>
-      <w:pPr>
-        <w:pBdr>
-          <w:top w:val="single" w:sz="4" w:space="1" w:color="auto"/>
-          <w:left w:val="single" w:sz="4" w:space="4" w:color="auto"/>
-          <w:bottom w:val="single" w:sz="4" w:space="1" w:color="auto"/>
-          <w:right w:val="single" w:sz="4" w:space="4" w:color="auto"/>
-        </w:pBdr>
-      </w:pPr>
-      <w:r>
-        <w:t>COT Explanation: [COT REASONING]</w:t>
-      </w:r>
-    </w:p>
-    <w:p>
-      <w:pPr>
-        <w:pBdr>
-          <w:top w:val="single" w:sz="4" w:space="1" w:color="auto"/>
-          <w:left w:val="single" w:sz="4" w:space="4" w:color="auto"/>
-          <w:bottom w:val="single" w:sz="4" w:space="1" w:color="auto"/>
-          <w:right w:val="single" w:sz="4" w:space="4" w:color="auto"/>
-        </w:pBdr>
-        <w:spacing w:after="0"/>
-      </w:pPr>
-      <w:r>
-        <w:t>Example-3:</w:t>
-      </w:r>
-    </w:p>
-    <w:p>
-      <w:pPr>
-        <w:pBdr>
-          <w:top w:val="single" w:sz="4" w:space="1" w:color="auto"/>
-          <w:left w:val="single" w:sz="4" w:space="4" w:color="auto"/>
-          <w:bottom w:val="single" w:sz="4" w:space="1" w:color="auto"/>
-          <w:right w:val="single" w:sz="4" w:space="4" w:color="auto"/>
-        </w:pBdr>
-        <w:spacing w:after="0"/>
-      </w:pPr>
-      <w:r>
-        <w:t xml:space="preserve">Sentence: </w:t>
-      </w:r>
-      <w:r>
-        <w:rPr>
-          <w:rFonts w:cs="Calibri"/>
-        </w:rPr>
-        <w:t>[TEXT]</w:t>
-      </w:r>
-    </w:p>
-    <w:p>
-      <w:pPr>
-        <w:pBdr>
-          <w:top w:val="single" w:sz="4" w:space="1" w:color="auto"/>
-          <w:left w:val="single" w:sz="4" w:space="4" w:color="auto"/>
-          <w:bottom w:val="single" w:sz="4" w:space="1" w:color="auto"/>
-          <w:right w:val="single" w:sz="4" w:space="4" w:color="auto"/>
-        </w:pBdr>
-        <w:spacing w:after="0"/>
-      </w:pPr>
-      <w:r>
-        <w:t>In the above sentence, the relationship between [HEAD ENTITY] and [TAIL ENTITY] entities is: [RELATIONSHIP]</w:t>
-      </w:r>
-    </w:p>
-    <w:p>
-      <w:pPr>
-        <w:pBdr>
-          <w:top w:val="single" w:sz="4" w:space="1" w:color="auto"/>
-          <w:left w:val="single" w:sz="4" w:space="4" w:color="auto"/>
-          <w:bottom w:val="single" w:sz="4" w:space="1" w:color="auto"/>
-          <w:right w:val="single" w:sz="4" w:space="4" w:color="auto"/>
-        </w:pBdr>
-      </w:pPr>
-      <w:r>
-        <w:t>COT Explanation: [COT REASONING]</w:t>
-      </w:r>
-    </w:p>
-    <w:p>
-      <w:pPr>
-        <w:pBdr>
-          <w:top w:val="single" w:sz="4" w:space="1" w:color="auto"/>
-          <w:left w:val="single" w:sz="4" w:space="4" w:color="auto"/>
-          <w:bottom w:val="single" w:sz="4" w:space="1" w:color="auto"/>
-          <w:right w:val="single" w:sz="4" w:space="4" w:color="auto"/>
-        </w:pBdr>
-        <w:spacing w:after="0"/>
-      </w:pPr>
-      <w:r>
-        <w:t>Example-4:</w:t>
-      </w:r>
-    </w:p>
-    <w:p>
-      <w:pPr>
-        <w:pBdr>
-          <w:top w:val="single" w:sz="4" w:space="1" w:color="auto"/>
-          <w:left w:val="single" w:sz="4" w:space="4" w:color="auto"/>
-          <w:bottom w:val="single" w:sz="4" w:space="1" w:color="auto"/>
-          <w:right w:val="single" w:sz="4" w:space="4" w:color="auto"/>
-        </w:pBdr>
-        <w:spacing w:after="0"/>
-      </w:pPr>
-      <w:r>
-        <w:t xml:space="preserve">Sentence: </w:t>
-      </w:r>
-      <w:r>
-        <w:rPr>
-          <w:rFonts w:cs="Calibri"/>
-        </w:rPr>
-        <w:t>[TEXT]</w:t>
-      </w:r>
-    </w:p>
-    <w:p>
-      <w:pPr>
-        <w:pBdr>
-          <w:top w:val="single" w:sz="4" w:space="1" w:color="auto"/>
-          <w:left w:val="single" w:sz="4" w:space="4" w:color="auto"/>
-          <w:bottom w:val="single" w:sz="4" w:space="1" w:color="auto"/>
-          <w:right w:val="single" w:sz="4" w:space="4" w:color="auto"/>
-        </w:pBdr>
-        <w:spacing w:after="0"/>
-      </w:pPr>
-      <w:r>
-        <w:t>In the above sentence, the relationship between [HEAD ENTITY] and [TAIL ENTITY] entities is: [RELATIONSHIP]</w:t>
-      </w:r>
-    </w:p>
-    <w:p>
-      <w:pPr>
-        <w:pBdr>
-          <w:top w:val="single" w:sz="4" w:space="1" w:color="auto"/>
-          <w:left w:val="single" w:sz="4" w:space="4" w:color="auto"/>
-          <w:bottom w:val="single" w:sz="4" w:space="1" w:color="auto"/>
-          <w:right w:val="single" w:sz="4" w:space="4" w:color="auto"/>
-        </w:pBdr>
-      </w:pPr>
-      <w:r>
-        <w:t>COT Explanation: [COT REASONING]</w:t>
-      </w:r>
-    </w:p>
-    <w:p>
-      <w:pPr>
-        <w:pBdr>
-          <w:top w:val="single" w:sz="4" w:space="1" w:color="auto"/>
-          <w:left w:val="single" w:sz="4" w:space="4" w:color="auto"/>
-          <w:bottom w:val="single" w:sz="4" w:space="1" w:color="auto"/>
-          <w:right w:val="single" w:sz="4" w:space="4" w:color="auto"/>
-        </w:pBdr>
-        <w:spacing w:after="0"/>
-      </w:pPr>
-      <w:r>
-        <w:t>Example-5:</w:t>
-      </w:r>
-    </w:p>
-    <w:p>
-      <w:pPr>
-        <w:pBdr>
-          <w:top w:val="single" w:sz="4" w:space="1" w:color="auto"/>
-          <w:left w:val="single" w:sz="4" w:space="4" w:color="auto"/>
-          <w:bottom w:val="single" w:sz="4" w:space="1" w:color="auto"/>
-          <w:right w:val="single" w:sz="4" w:space="4" w:color="auto"/>
-        </w:pBdr>
-        <w:spacing w:after="0"/>
-      </w:pPr>
-      <w:r>
-        <w:t xml:space="preserve">Sentence: </w:t>
-      </w:r>
-      <w:r>
-        <w:rPr>
-          <w:rFonts w:cs="Calibri"/>
-        </w:rPr>
-        <w:t>[TEXT]</w:t>
-      </w:r>
-    </w:p>
-    <w:p>
-      <w:pPr>
-        <w:pBdr>
-          <w:top w:val="single" w:sz="4" w:space="1" w:color="auto"/>
-          <w:left w:val="single" w:sz="4" w:space="4" w:color="auto"/>
-          <w:bottom w:val="single" w:sz="4" w:space="1" w:color="auto"/>
-          <w:right w:val="single" w:sz="4" w:space="4" w:color="auto"/>
-        </w:pBdr>
-        <w:spacing w:after="0"/>
-      </w:pPr>
-      <w:r>
-        <w:t>In the above sentence, the relationship between [HEAD ENTITY] and [TAIL ENTITY] entities is: [RELATIONSHIP]</w:t>
-      </w:r>
-    </w:p>
-    <w:p>
-      <w:pPr>
-        <w:pBdr>
-          <w:top w:val="single" w:sz="4" w:space="1" w:color="auto"/>
-          <w:left w:val="single" w:sz="4" w:space="4" w:color="auto"/>
-          <w:bottom w:val="single" w:sz="4" w:space="1" w:color="auto"/>
-          <w:right w:val="single" w:sz="4" w:space="4" w:color="auto"/>
-        </w:pBdr>
-      </w:pPr>
-      <w:r>
-        <w:t>COT Explanation: [COT REASONING]</w:t>
-      </w:r>
-    </w:p>
-    <w:p>
-      <w:pPr>
-        <w:pBdr>
-          <w:top w:val="single" w:sz="4" w:space="1" w:color="auto"/>
-          <w:left w:val="single" w:sz="4" w:space="4" w:color="auto"/>
-          <w:bottom w:val="single" w:sz="4" w:space="1" w:color="auto"/>
-          <w:right w:val="single" w:sz="4" w:space="4" w:color="auto"/>
-        </w:pBdr>
-      </w:pPr>
-      <w:r>
-        <w:t>----</w:t>
-      </w:r>
-    </w:p>
-    <w:p>
-      <w:pPr>
-        <w:pBdr>
-          <w:top w:val="single" w:sz="4" w:space="1" w:color="auto"/>
-          <w:left w:val="single" w:sz="4" w:space="4" w:color="auto"/>
-          <w:bottom w:val="single" w:sz="4" w:space="1" w:color="auto"/>
-          <w:right w:val="single" w:sz="4" w:space="4" w:color="auto"/>
-        </w:pBdr>
-        <w:rPr>
-          <w:rFonts w:cs="Calibri"/>
-        </w:rPr>
-      </w:pPr>
-      <w:r>
-        <w:rPr>
-          <w:rFonts w:cs="Calibri"/>
-        </w:rPr>
-        <w:t>Sentence: [TEXT]</w:t>
-      </w:r>
-    </w:p>
-    <w:p>
-      <w:pPr>
-        <w:pBdr>
-          <w:top w:val="single" w:sz="4" w:space="1" w:color="auto"/>
-          <w:left w:val="single" w:sz="4" w:space="4" w:color="auto"/>
-          <w:bottom w:val="single" w:sz="4" w:space="1" w:color="auto"/>
-          <w:right w:val="single" w:sz="4" w:space="4" w:color="auto"/>
-        </w:pBdr>
-      </w:pPr>
-      <w:r>
-        <w:t>In the given sentence, the relationship between [HEAD ENTITY] and [TAIL ENTITY] entities is:'''</w:t>
-      </w:r>
-    </w:p>
-    <w:p/>
+      </w:pPr>
+      <w:r>
+        <w:t xml:space="preserve">Generate Chain of Thoughts in </w:t>
+      </w:r>
+      <w:r>
+        <w:t>2-3 short and simple sentences</w:t>
+      </w:r>
+      <w:r>
+        <w:t xml:space="preserve">, which explain relationship between entities [HEAD ENTITY] and [TAIL ENTITY] is </w:t>
+      </w:r>
+      <w:r>
+        <w:t>[RELATIONSHIP]</w:t>
+      </w:r>
+      <w:r>
+        <w:t xml:space="preserve"> in above sentence.</w:t>
+      </w:r>
+    </w:p>
     <w:p/>
     <w:p/>
     <w:sectPr>

</xml_diff>